<commit_message>
TP carreglado (Lumens habian side interpretados mal)
</commit_message>
<xml_diff>
--- a/4.Aprendizaje Supervisado/Trabajo Practico/Actividad_Computer_Vision_C1.docx
+++ b/4.Aprendizaje Supervisado/Trabajo Practico/Actividad_Computer_Vision_C1.docx
@@ -1,6 +1,6 @@
 
 <file path=word/document.xml><?xml version="1.0" encoding="utf-8"?>
-<w:document xmlns:wpc="http://schemas.microsoft.com/office/word/2010/wordprocessingCanvas" xmlns:cx="http://schemas.microsoft.com/office/drawing/2014/chartex" xmlns:cx1="http://schemas.microsoft.com/office/drawing/2015/9/8/chartex" xmlns:cx2="http://schemas.microsoft.com/office/drawing/2015/10/21/chartex" xmlns:cx3="http://schemas.microsoft.com/office/drawing/2016/5/9/chartex" xmlns:cx4="http://schemas.microsoft.com/office/drawing/2016/5/10/chartex" xmlns:cx5="http://schemas.microsoft.com/office/drawing/2016/5/11/chartex" xmlns:cx6="http://schemas.microsoft.com/office/drawing/2016/5/12/chartex" xmlns:cx7="http://schemas.microsoft.com/office/drawing/2016/5/13/chartex" xmlns:cx8="http://schemas.microsoft.com/office/drawing/2016/5/14/chartex" xmlns:mc="http://schemas.openxmlformats.org/markup-compatibility/2006" xmlns:aink="http://schemas.microsoft.com/office/drawing/2016/ink" xmlns:am3d="http://schemas.microsoft.com/office/drawing/2017/model3d" xmlns:o="urn:schemas-microsoft-com:office:office" xmlns:r="http://schemas.openxmlformats.org/officeDocument/2006/relationships" xmlns:m="http://schemas.openxmlformats.org/officeDocument/2006/math" xmlns:v="urn:schemas-microsoft-com:vml" xmlns:wp14="http://schemas.microsoft.com/office/word/2010/wordprocessingDrawing" xmlns:wp="http://schemas.openxmlformats.org/drawingml/2006/wordprocessingDrawing" xmlns:w10="urn:schemas-microsoft-com:office:word" xmlns:w="http://schemas.openxmlformats.org/wordprocessingml/2006/main" xmlns:w14="http://schemas.microsoft.com/office/word/2010/wordml" xmlns:w15="http://schemas.microsoft.com/office/word/2012/wordml" xmlns:w16cex="http://schemas.microsoft.com/office/word/2018/wordml/cex" xmlns:w16cid="http://schemas.microsoft.com/office/word/2016/wordml/cid" xmlns:w16="http://schemas.microsoft.com/office/word/2018/wordml" xmlns:w16sdtdh="http://schemas.microsoft.com/office/word/2020/wordml/sdtdatahash" xmlns:w16se="http://schemas.microsoft.com/office/word/2015/wordml/symex" xmlns:wpg="http://schemas.microsoft.com/office/word/2010/wordprocessingGroup" xmlns:wpi="http://schemas.microsoft.com/office/word/2010/wordprocessingInk" xmlns:wne="http://schemas.microsoft.com/office/word/2006/wordml" xmlns:wps="http://schemas.microsoft.com/office/word/2010/wordprocessingShape" mc:Ignorable="w14 w15 w16se w16cid w16 w16cex w16sdtdh wp14">
+<w:document xmlns:wpc="http://schemas.microsoft.com/office/word/2010/wordprocessingCanvas" xmlns:cx="http://schemas.microsoft.com/office/drawing/2014/chartex" xmlns:cx1="http://schemas.microsoft.com/office/drawing/2015/9/8/chartex" xmlns:cx2="http://schemas.microsoft.com/office/drawing/2015/10/21/chartex" xmlns:cx3="http://schemas.microsoft.com/office/drawing/2016/5/9/chartex" xmlns:cx4="http://schemas.microsoft.com/office/drawing/2016/5/10/chartex" xmlns:cx5="http://schemas.microsoft.com/office/drawing/2016/5/11/chartex" xmlns:cx6="http://schemas.microsoft.com/office/drawing/2016/5/12/chartex" xmlns:cx7="http://schemas.microsoft.com/office/drawing/2016/5/13/chartex" xmlns:cx8="http://schemas.microsoft.com/office/drawing/2016/5/14/chartex" xmlns:mc="http://schemas.openxmlformats.org/markup-compatibility/2006" xmlns:aink="http://schemas.microsoft.com/office/drawing/2016/ink" xmlns:am3d="http://schemas.microsoft.com/office/drawing/2017/model3d" xmlns:o="urn:schemas-microsoft-com:office:office" xmlns:oel="http://schemas.microsoft.com/office/2019/extlst" xmlns:r="http://schemas.openxmlformats.org/officeDocument/2006/relationships" xmlns:m="http://schemas.openxmlformats.org/officeDocument/2006/math" xmlns:v="urn:schemas-microsoft-com:vml" xmlns:wp14="http://schemas.microsoft.com/office/word/2010/wordprocessingDrawing" xmlns:wp="http://schemas.openxmlformats.org/drawingml/2006/wordprocessingDrawing" xmlns:w10="urn:schemas-microsoft-com:office:word" xmlns:w="http://schemas.openxmlformats.org/wordprocessingml/2006/main" xmlns:w14="http://schemas.microsoft.com/office/word/2010/wordml" xmlns:w15="http://schemas.microsoft.com/office/word/2012/wordml" xmlns:w16cex="http://schemas.microsoft.com/office/word/2018/wordml/cex" xmlns:w16cid="http://schemas.microsoft.com/office/word/2016/wordml/cid" xmlns:w16="http://schemas.microsoft.com/office/word/2018/wordml" xmlns:w16du="http://schemas.microsoft.com/office/word/2023/wordml/word16du" xmlns:w16sdtdh="http://schemas.microsoft.com/office/word/2020/wordml/sdtdatahash" xmlns:w16sdtfl="http://schemas.microsoft.com/office/word/2024/wordml/sdtformatlock" xmlns:w16se="http://schemas.microsoft.com/office/word/2015/wordml/symex" xmlns:wpg="http://schemas.microsoft.com/office/word/2010/wordprocessingGroup" xmlns:wpi="http://schemas.microsoft.com/office/word/2010/wordprocessingInk" xmlns:wne="http://schemas.microsoft.com/office/word/2006/wordml" xmlns:wps="http://schemas.microsoft.com/office/word/2010/wordprocessingShape" mc:Ignorable="w14 w15 w16se w16cid w16 w16cex w16sdtdh w16sdtfl w16du wp14">
   <w:body>
     <w:p>
       <w:pPr>
@@ -337,7 +337,7 @@
           <w:sz w:val="28"/>
           <w:szCs w:val="28"/>
         </w:rPr>
-        <w:t>Estudiante 1</w:t>
+        <w:t>Estudiante</w:t>
       </w:r>
       <w:r>
         <w:rPr>
@@ -347,6 +347,15 @@
           <w:szCs w:val="28"/>
         </w:rPr>
         <w:t xml:space="preserve">: </w:t>
+      </w:r>
+      <w:r>
+        <w:rPr>
+          <w:b/>
+          <w:bCs/>
+          <w:sz w:val="28"/>
+          <w:szCs w:val="28"/>
+        </w:rPr>
+        <w:t>Peralta Rodrigo Hernan</w:t>
       </w:r>
     </w:p>
     <w:p>
@@ -359,28 +368,10 @@
           <w:szCs w:val="28"/>
         </w:rPr>
       </w:pPr>
-      <w:r>
-        <w:rPr>
-          <w:b/>
-          <w:bCs/>
-          <w:sz w:val="28"/>
-          <w:szCs w:val="28"/>
-        </w:rPr>
-        <w:t>Estudiante 2</w:t>
-      </w:r>
-      <w:r>
-        <w:rPr>
-          <w:b/>
-          <w:bCs/>
-          <w:sz w:val="28"/>
-          <w:szCs w:val="28"/>
-        </w:rPr>
-        <w:t>:</w:t>
-      </w:r>
     </w:p>
     <w:p>
       <w:pPr>
-        <w:pStyle w:val="Prrafodelista"/>
+        <w:pStyle w:val="ListParagraph"/>
         <w:numPr>
           <w:ilvl w:val="0"/>
           <w:numId w:val="1"/>
@@ -410,6 +401,215 @@
       </w:pPr>
       <w:r>
         <w:rPr>
+          <w:noProof/>
+        </w:rPr>
+        <w:drawing>
+          <wp:anchor distT="0" distB="0" distL="114300" distR="114300" simplePos="0" relativeHeight="251719680" behindDoc="0" locked="0" layoutInCell="1" allowOverlap="1" wp14:anchorId="77368C47" wp14:editId="53160F82">
+            <wp:simplePos x="0" y="0"/>
+            <wp:positionH relativeFrom="margin">
+              <wp:posOffset>3720465</wp:posOffset>
+            </wp:positionH>
+            <wp:positionV relativeFrom="paragraph">
+              <wp:posOffset>542290</wp:posOffset>
+            </wp:positionV>
+            <wp:extent cx="1600200" cy="1704975"/>
+            <wp:effectExtent l="0" t="0" r="0" b="9525"/>
+            <wp:wrapThrough wrapText="bothSides">
+              <wp:wrapPolygon edited="0">
+                <wp:start x="0" y="0"/>
+                <wp:lineTo x="0" y="21479"/>
+                <wp:lineTo x="21343" y="21479"/>
+                <wp:lineTo x="21343" y="0"/>
+                <wp:lineTo x="0" y="0"/>
+              </wp:wrapPolygon>
+            </wp:wrapThrough>
+            <wp:docPr id="1132775170" name="Picture 30"/>
+            <wp:cNvGraphicFramePr>
+              <a:graphicFrameLocks xmlns:a="http://schemas.openxmlformats.org/drawingml/2006/main" noChangeAspect="1"/>
+            </wp:cNvGraphicFramePr>
+            <a:graphic xmlns:a="http://schemas.openxmlformats.org/drawingml/2006/main">
+              <a:graphicData uri="http://schemas.openxmlformats.org/drawingml/2006/picture">
+                <pic:pic xmlns:pic="http://schemas.openxmlformats.org/drawingml/2006/picture">
+                  <pic:nvPicPr>
+                    <pic:cNvPr id="0" name="Picture 3"/>
+                    <pic:cNvPicPr>
+                      <a:picLocks noChangeAspect="1" noChangeArrowheads="1"/>
+                    </pic:cNvPicPr>
+                  </pic:nvPicPr>
+                  <pic:blipFill>
+                    <a:blip r:embed="rId7">
+                      <a:extLst>
+                        <a:ext uri="{28A0092B-C50C-407E-A947-70E740481C1C}">
+                          <a14:useLocalDpi xmlns:a14="http://schemas.microsoft.com/office/drawing/2010/main" val="0"/>
+                        </a:ext>
+                      </a:extLst>
+                    </a:blip>
+                    <a:srcRect/>
+                    <a:stretch>
+                      <a:fillRect/>
+                    </a:stretch>
+                  </pic:blipFill>
+                  <pic:spPr bwMode="auto">
+                    <a:xfrm>
+                      <a:off x="0" y="0"/>
+                      <a:ext cx="1600200" cy="1704975"/>
+                    </a:xfrm>
+                    <a:prstGeom prst="rect">
+                      <a:avLst/>
+                    </a:prstGeom>
+                    <a:noFill/>
+                  </pic:spPr>
+                </pic:pic>
+              </a:graphicData>
+            </a:graphic>
+            <wp14:sizeRelH relativeFrom="margin">
+              <wp14:pctWidth>0</wp14:pctWidth>
+            </wp14:sizeRelH>
+            <wp14:sizeRelV relativeFrom="margin">
+              <wp14:pctHeight>0</wp14:pctHeight>
+            </wp14:sizeRelV>
+          </wp:anchor>
+        </w:drawing>
+      </w:r>
+      <w:r>
+        <w:rPr>
+          <w:noProof/>
+        </w:rPr>
+        <w:drawing>
+          <wp:anchor distT="0" distB="0" distL="114300" distR="114300" simplePos="0" relativeHeight="251718656" behindDoc="0" locked="0" layoutInCell="1" allowOverlap="1" wp14:anchorId="6847B042" wp14:editId="2667C50A">
+            <wp:simplePos x="0" y="0"/>
+            <wp:positionH relativeFrom="margin">
+              <wp:posOffset>1872615</wp:posOffset>
+            </wp:positionH>
+            <wp:positionV relativeFrom="paragraph">
+              <wp:posOffset>552450</wp:posOffset>
+            </wp:positionV>
+            <wp:extent cx="1622425" cy="1689735"/>
+            <wp:effectExtent l="0" t="0" r="0" b="5715"/>
+            <wp:wrapThrough wrapText="bothSides">
+              <wp:wrapPolygon edited="0">
+                <wp:start x="0" y="0"/>
+                <wp:lineTo x="0" y="21430"/>
+                <wp:lineTo x="21304" y="21430"/>
+                <wp:lineTo x="21304" y="0"/>
+                <wp:lineTo x="0" y="0"/>
+              </wp:wrapPolygon>
+            </wp:wrapThrough>
+            <wp:docPr id="762460620" name="Picture 29"/>
+            <wp:cNvGraphicFramePr>
+              <a:graphicFrameLocks xmlns:a="http://schemas.openxmlformats.org/drawingml/2006/main" noChangeAspect="1"/>
+            </wp:cNvGraphicFramePr>
+            <a:graphic xmlns:a="http://schemas.openxmlformats.org/drawingml/2006/main">
+              <a:graphicData uri="http://schemas.openxmlformats.org/drawingml/2006/picture">
+                <pic:pic xmlns:pic="http://schemas.openxmlformats.org/drawingml/2006/picture">
+                  <pic:nvPicPr>
+                    <pic:cNvPr id="0" name="Picture 2"/>
+                    <pic:cNvPicPr>
+                      <a:picLocks noChangeAspect="1" noChangeArrowheads="1"/>
+                    </pic:cNvPicPr>
+                  </pic:nvPicPr>
+                  <pic:blipFill>
+                    <a:blip r:embed="rId8">
+                      <a:extLst>
+                        <a:ext uri="{28A0092B-C50C-407E-A947-70E740481C1C}">
+                          <a14:useLocalDpi xmlns:a14="http://schemas.microsoft.com/office/drawing/2010/main" val="0"/>
+                        </a:ext>
+                      </a:extLst>
+                    </a:blip>
+                    <a:srcRect/>
+                    <a:stretch>
+                      <a:fillRect/>
+                    </a:stretch>
+                  </pic:blipFill>
+                  <pic:spPr bwMode="auto">
+                    <a:xfrm>
+                      <a:off x="0" y="0"/>
+                      <a:ext cx="1622425" cy="1689735"/>
+                    </a:xfrm>
+                    <a:prstGeom prst="rect">
+                      <a:avLst/>
+                    </a:prstGeom>
+                    <a:noFill/>
+                  </pic:spPr>
+                </pic:pic>
+              </a:graphicData>
+            </a:graphic>
+            <wp14:sizeRelH relativeFrom="margin">
+              <wp14:pctWidth>0</wp14:pctWidth>
+            </wp14:sizeRelH>
+            <wp14:sizeRelV relativeFrom="margin">
+              <wp14:pctHeight>0</wp14:pctHeight>
+            </wp14:sizeRelV>
+          </wp:anchor>
+        </w:drawing>
+      </w:r>
+      <w:r>
+        <w:drawing>
+          <wp:anchor distT="0" distB="0" distL="114300" distR="114300" simplePos="0" relativeHeight="251717632" behindDoc="0" locked="0" layoutInCell="1" allowOverlap="1" wp14:anchorId="2533220E" wp14:editId="651FA953">
+            <wp:simplePos x="0" y="0"/>
+            <wp:positionH relativeFrom="column">
+              <wp:posOffset>24765</wp:posOffset>
+            </wp:positionH>
+            <wp:positionV relativeFrom="paragraph">
+              <wp:posOffset>552450</wp:posOffset>
+            </wp:positionV>
+            <wp:extent cx="1680845" cy="1689735"/>
+            <wp:effectExtent l="0" t="0" r="0" b="5715"/>
+            <wp:wrapThrough wrapText="bothSides">
+              <wp:wrapPolygon edited="0">
+                <wp:start x="0" y="0"/>
+                <wp:lineTo x="0" y="21430"/>
+                <wp:lineTo x="21298" y="21430"/>
+                <wp:lineTo x="21298" y="0"/>
+                <wp:lineTo x="0" y="0"/>
+              </wp:wrapPolygon>
+            </wp:wrapThrough>
+            <wp:docPr id="874282810" name="Picture 1"/>
+            <wp:cNvGraphicFramePr>
+              <a:graphicFrameLocks xmlns:a="http://schemas.openxmlformats.org/drawingml/2006/main" noChangeAspect="1"/>
+            </wp:cNvGraphicFramePr>
+            <a:graphic xmlns:a="http://schemas.openxmlformats.org/drawingml/2006/main">
+              <a:graphicData uri="http://schemas.openxmlformats.org/drawingml/2006/picture">
+                <pic:pic xmlns:pic="http://schemas.openxmlformats.org/drawingml/2006/picture">
+                  <pic:nvPicPr>
+                    <pic:cNvPr id="874282810" name=""/>
+                    <pic:cNvPicPr/>
+                  </pic:nvPicPr>
+                  <pic:blipFill>
+                    <a:blip r:embed="rId9">
+                      <a:extLst>
+                        <a:ext uri="{28A0092B-C50C-407E-A947-70E740481C1C}">
+                          <a14:useLocalDpi xmlns:a14="http://schemas.microsoft.com/office/drawing/2010/main" val="0"/>
+                        </a:ext>
+                      </a:extLst>
+                    </a:blip>
+                    <a:stretch>
+                      <a:fillRect/>
+                    </a:stretch>
+                  </pic:blipFill>
+                  <pic:spPr>
+                    <a:xfrm>
+                      <a:off x="0" y="0"/>
+                      <a:ext cx="1680845" cy="1689735"/>
+                    </a:xfrm>
+                    <a:prstGeom prst="rect">
+                      <a:avLst/>
+                    </a:prstGeom>
+                  </pic:spPr>
+                </pic:pic>
+              </a:graphicData>
+            </a:graphic>
+            <wp14:sizeRelH relativeFrom="margin">
+              <wp14:pctWidth>0</wp14:pctWidth>
+            </wp14:sizeRelH>
+            <wp14:sizeRelV relativeFrom="margin">
+              <wp14:pctHeight>0</wp14:pctHeight>
+            </wp14:sizeRelV>
+          </wp:anchor>
+        </w:drawing>
+      </w:r>
+      <w:r>
+        <w:rPr>
           <w:b/>
           <w:bCs/>
           <w:noProof/>
@@ -417,7 +617,7 @@
         <mc:AlternateContent>
           <mc:Choice Requires="wps">
             <w:drawing>
-              <wp:anchor distT="45720" distB="45720" distL="114300" distR="114300" simplePos="0" relativeHeight="251675648" behindDoc="0" locked="0" layoutInCell="1" allowOverlap="1" wp14:anchorId="65652848" wp14:editId="3DD16194">
+              <wp:anchor distT="45720" distB="45720" distL="114300" distR="114300" simplePos="0" relativeHeight="251675648" behindDoc="0" locked="0" layoutInCell="1" allowOverlap="1" wp14:anchorId="65652848" wp14:editId="6E10800A">
                 <wp:simplePos x="0" y="0"/>
                 <wp:positionH relativeFrom="margin">
                   <wp:align>right</wp:align>
@@ -664,13 +864,8 @@
                             <w:pPr>
                               <w:jc w:val="center"/>
                             </w:pPr>
-                            <w:proofErr w:type="spellStart"/>
                             <w:r>
-                              <w:t>Crop</w:t>
-                            </w:r>
-                            <w:proofErr w:type="spellEnd"/>
-                            <w:r>
-                              <w:t xml:space="preserve"> del mayor lumen</w:t>
+                              <w:t>Crop del mayor lumen</w:t>
                             </w:r>
                             <w:r>
                               <w:t xml:space="preserve"> #7</w:t>
@@ -1711,66 +1906,208 @@
         </mc:AlternateContent>
       </w:r>
     </w:p>
+    <w:p>
+      <w:r>
+        <w:drawing>
+          <wp:anchor distT="0" distB="0" distL="114300" distR="114300" simplePos="0" relativeHeight="251722752" behindDoc="0" locked="0" layoutInCell="1" allowOverlap="1" wp14:anchorId="4F367D75" wp14:editId="73FBA9BA">
+            <wp:simplePos x="0" y="0"/>
+            <wp:positionH relativeFrom="column">
+              <wp:posOffset>3749040</wp:posOffset>
+            </wp:positionH>
+            <wp:positionV relativeFrom="paragraph">
+              <wp:posOffset>2725420</wp:posOffset>
+            </wp:positionV>
+            <wp:extent cx="1562100" cy="1649095"/>
+            <wp:effectExtent l="0" t="0" r="0" b="8255"/>
+            <wp:wrapThrough wrapText="bothSides">
+              <wp:wrapPolygon edited="0">
+                <wp:start x="0" y="0"/>
+                <wp:lineTo x="0" y="21459"/>
+                <wp:lineTo x="21337" y="21459"/>
+                <wp:lineTo x="21337" y="0"/>
+                <wp:lineTo x="0" y="0"/>
+              </wp:wrapPolygon>
+            </wp:wrapThrough>
+            <wp:docPr id="12074277" name="Picture 1"/>
+            <wp:cNvGraphicFramePr>
+              <a:graphicFrameLocks xmlns:a="http://schemas.openxmlformats.org/drawingml/2006/main" noChangeAspect="1"/>
+            </wp:cNvGraphicFramePr>
+            <a:graphic xmlns:a="http://schemas.openxmlformats.org/drawingml/2006/main">
+              <a:graphicData uri="http://schemas.openxmlformats.org/drawingml/2006/picture">
+                <pic:pic xmlns:pic="http://schemas.openxmlformats.org/drawingml/2006/picture">
+                  <pic:nvPicPr>
+                    <pic:cNvPr id="12074277" name=""/>
+                    <pic:cNvPicPr/>
+                  </pic:nvPicPr>
+                  <pic:blipFill>
+                    <a:blip r:embed="rId10">
+                      <a:extLst>
+                        <a:ext uri="{28A0092B-C50C-407E-A947-70E740481C1C}">
+                          <a14:useLocalDpi xmlns:a14="http://schemas.microsoft.com/office/drawing/2010/main" val="0"/>
+                        </a:ext>
+                      </a:extLst>
+                    </a:blip>
+                    <a:stretch>
+                      <a:fillRect/>
+                    </a:stretch>
+                  </pic:blipFill>
+                  <pic:spPr>
+                    <a:xfrm>
+                      <a:off x="0" y="0"/>
+                      <a:ext cx="1562100" cy="1649095"/>
+                    </a:xfrm>
+                    <a:prstGeom prst="rect">
+                      <a:avLst/>
+                    </a:prstGeom>
+                  </pic:spPr>
+                </pic:pic>
+              </a:graphicData>
+            </a:graphic>
+            <wp14:sizeRelH relativeFrom="margin">
+              <wp14:pctWidth>0</wp14:pctWidth>
+            </wp14:sizeRelH>
+            <wp14:sizeRelV relativeFrom="margin">
+              <wp14:pctHeight>0</wp14:pctHeight>
+            </wp14:sizeRelV>
+          </wp:anchor>
+        </w:drawing>
+      </w:r>
+      <w:r>
+        <w:drawing>
+          <wp:anchor distT="0" distB="0" distL="114300" distR="114300" simplePos="0" relativeHeight="251721728" behindDoc="0" locked="0" layoutInCell="1" allowOverlap="1" wp14:anchorId="32CD9B56" wp14:editId="5C903F00">
+            <wp:simplePos x="0" y="0"/>
+            <wp:positionH relativeFrom="margin">
+              <wp:align>center</wp:align>
+            </wp:positionH>
+            <wp:positionV relativeFrom="paragraph">
+              <wp:posOffset>2708275</wp:posOffset>
+            </wp:positionV>
+            <wp:extent cx="1571625" cy="1681480"/>
+            <wp:effectExtent l="0" t="0" r="9525" b="0"/>
+            <wp:wrapThrough wrapText="bothSides">
+              <wp:wrapPolygon edited="0">
+                <wp:start x="0" y="0"/>
+                <wp:lineTo x="0" y="21290"/>
+                <wp:lineTo x="21469" y="21290"/>
+                <wp:lineTo x="21469" y="0"/>
+                <wp:lineTo x="0" y="0"/>
+              </wp:wrapPolygon>
+            </wp:wrapThrough>
+            <wp:docPr id="345452478" name="Picture 1"/>
+            <wp:cNvGraphicFramePr>
+              <a:graphicFrameLocks xmlns:a="http://schemas.openxmlformats.org/drawingml/2006/main" noChangeAspect="1"/>
+            </wp:cNvGraphicFramePr>
+            <a:graphic xmlns:a="http://schemas.openxmlformats.org/drawingml/2006/main">
+              <a:graphicData uri="http://schemas.openxmlformats.org/drawingml/2006/picture">
+                <pic:pic xmlns:pic="http://schemas.openxmlformats.org/drawingml/2006/picture">
+                  <pic:nvPicPr>
+                    <pic:cNvPr id="345452478" name=""/>
+                    <pic:cNvPicPr/>
+                  </pic:nvPicPr>
+                  <pic:blipFill>
+                    <a:blip r:embed="rId11">
+                      <a:extLst>
+                        <a:ext uri="{28A0092B-C50C-407E-A947-70E740481C1C}">
+                          <a14:useLocalDpi xmlns:a14="http://schemas.microsoft.com/office/drawing/2010/main" val="0"/>
+                        </a:ext>
+                      </a:extLst>
+                    </a:blip>
+                    <a:stretch>
+                      <a:fillRect/>
+                    </a:stretch>
+                  </pic:blipFill>
+                  <pic:spPr>
+                    <a:xfrm>
+                      <a:off x="0" y="0"/>
+                      <a:ext cx="1571625" cy="1681480"/>
+                    </a:xfrm>
+                    <a:prstGeom prst="rect">
+                      <a:avLst/>
+                    </a:prstGeom>
+                  </pic:spPr>
+                </pic:pic>
+              </a:graphicData>
+            </a:graphic>
+            <wp14:sizeRelH relativeFrom="margin">
+              <wp14:pctWidth>0</wp14:pctWidth>
+            </wp14:sizeRelH>
+            <wp14:sizeRelV relativeFrom="margin">
+              <wp14:pctHeight>0</wp14:pctHeight>
+            </wp14:sizeRelV>
+          </wp:anchor>
+        </w:drawing>
+      </w:r>
+      <w:r>
+        <w:drawing>
+          <wp:anchor distT="0" distB="0" distL="114300" distR="114300" simplePos="0" relativeHeight="251720704" behindDoc="0" locked="0" layoutInCell="1" allowOverlap="1" wp14:anchorId="47272519" wp14:editId="6A7CE84B">
+            <wp:simplePos x="0" y="0"/>
+            <wp:positionH relativeFrom="margin">
+              <wp:posOffset>72390</wp:posOffset>
+            </wp:positionH>
+            <wp:positionV relativeFrom="paragraph">
+              <wp:posOffset>2695575</wp:posOffset>
+            </wp:positionV>
+            <wp:extent cx="1574165" cy="1684020"/>
+            <wp:effectExtent l="0" t="0" r="6985" b="0"/>
+            <wp:wrapThrough wrapText="bothSides">
+              <wp:wrapPolygon edited="0">
+                <wp:start x="0" y="0"/>
+                <wp:lineTo x="0" y="21258"/>
+                <wp:lineTo x="21434" y="21258"/>
+                <wp:lineTo x="21434" y="0"/>
+                <wp:lineTo x="0" y="0"/>
+              </wp:wrapPolygon>
+            </wp:wrapThrough>
+            <wp:docPr id="1203237392" name="Picture 1"/>
+            <wp:cNvGraphicFramePr>
+              <a:graphicFrameLocks xmlns:a="http://schemas.openxmlformats.org/drawingml/2006/main" noChangeAspect="1"/>
+            </wp:cNvGraphicFramePr>
+            <a:graphic xmlns:a="http://schemas.openxmlformats.org/drawingml/2006/main">
+              <a:graphicData uri="http://schemas.openxmlformats.org/drawingml/2006/picture">
+                <pic:pic xmlns:pic="http://schemas.openxmlformats.org/drawingml/2006/picture">
+                  <pic:nvPicPr>
+                    <pic:cNvPr id="1203237392" name=""/>
+                    <pic:cNvPicPr/>
+                  </pic:nvPicPr>
+                  <pic:blipFill>
+                    <a:blip r:embed="rId12">
+                      <a:extLst>
+                        <a:ext uri="{28A0092B-C50C-407E-A947-70E740481C1C}">
+                          <a14:useLocalDpi xmlns:a14="http://schemas.microsoft.com/office/drawing/2010/main" val="0"/>
+                        </a:ext>
+                      </a:extLst>
+                    </a:blip>
+                    <a:stretch>
+                      <a:fillRect/>
+                    </a:stretch>
+                  </pic:blipFill>
+                  <pic:spPr>
+                    <a:xfrm>
+                      <a:off x="0" y="0"/>
+                      <a:ext cx="1574165" cy="1684020"/>
+                    </a:xfrm>
+                    <a:prstGeom prst="rect">
+                      <a:avLst/>
+                    </a:prstGeom>
+                  </pic:spPr>
+                </pic:pic>
+              </a:graphicData>
+            </a:graphic>
+            <wp14:sizeRelH relativeFrom="margin">
+              <wp14:pctWidth>0</wp14:pctWidth>
+            </wp14:sizeRelH>
+            <wp14:sizeRelV relativeFrom="margin">
+              <wp14:pctHeight>0</wp14:pctHeight>
+            </wp14:sizeRelV>
+          </wp:anchor>
+        </w:drawing>
+      </w:r>
+    </w:p>
     <w:p/>
-    <w:p/>
-    <w:p/>
-    <w:p/>
-    <w:p>
-      <w:pPr>
-        <w:tabs>
-          <w:tab w:val="left" w:pos="6405"/>
-        </w:tabs>
-      </w:pPr>
-      <w:r>
-        <w:tab/>
-      </w:r>
-    </w:p>
-    <w:p>
-      <w:pPr>
-        <w:tabs>
-          <w:tab w:val="left" w:pos="6405"/>
-        </w:tabs>
-      </w:pPr>
-    </w:p>
-    <w:p>
-      <w:pPr>
-        <w:tabs>
-          <w:tab w:val="left" w:pos="6405"/>
-        </w:tabs>
-      </w:pPr>
-    </w:p>
-    <w:p>
-      <w:pPr>
-        <w:tabs>
-          <w:tab w:val="left" w:pos="6405"/>
-        </w:tabs>
-      </w:pPr>
-    </w:p>
-    <w:p>
-      <w:pPr>
-        <w:tabs>
-          <w:tab w:val="left" w:pos="6405"/>
-        </w:tabs>
-      </w:pPr>
-    </w:p>
-    <w:p>
-      <w:pPr>
-        <w:tabs>
-          <w:tab w:val="left" w:pos="6405"/>
-        </w:tabs>
-      </w:pPr>
-    </w:p>
-    <w:p>
-      <w:pPr>
-        <w:tabs>
-          <w:tab w:val="left" w:pos="6405"/>
-        </w:tabs>
-      </w:pPr>
-    </w:p>
     <w:tbl>
       <w:tblPr>
-        <w:tblStyle w:val="Tablaconcuadrcula"/>
-        <w:tblpPr w:leftFromText="141" w:rightFromText="141" w:vertAnchor="text" w:horzAnchor="margin" w:tblpY="1839"/>
+        <w:tblStyle w:val="TableGrid"/>
+        <w:tblpPr w:leftFromText="141" w:rightFromText="141" w:vertAnchor="text" w:horzAnchor="page" w:tblpX="1246" w:tblpY="277"/>
         <w:tblW w:w="0" w:type="auto"/>
         <w:tblLook w:val="04A0" w:firstRow="1" w:lastRow="0" w:firstColumn="1" w:lastColumn="0" w:noHBand="0" w:noVBand="1"/>
       </w:tblPr>
@@ -1892,6 +2229,16 @@
                 <w:lang w:eastAsia="es-ES"/>
               </w:rPr>
             </w:pPr>
+            <w:r>
+              <w:rPr>
+                <w:rFonts w:ascii="Courier New" w:eastAsia="Times New Roman" w:hAnsi="Courier New" w:cs="Courier New"/>
+                <w:color w:val="000000"/>
+                <w:sz w:val="21"/>
+                <w:szCs w:val="21"/>
+                <w:lang w:eastAsia="es-ES"/>
+              </w:rPr>
+              <w:t>14555.0</w:t>
+            </w:r>
           </w:p>
         </w:tc>
       </w:tr>
@@ -1922,27 +2269,7 @@
                 <w:sz w:val="20"/>
                 <w:szCs w:val="20"/>
               </w:rPr>
-              <w:t xml:space="preserve">Área de la </w:t>
-            </w:r>
-            <w:proofErr w:type="spellStart"/>
-            <w:r>
-              <w:rPr>
-                <w:i/>
-                <w:iCs/>
-                <w:sz w:val="20"/>
-                <w:szCs w:val="20"/>
-              </w:rPr>
-              <w:t>bounding</w:t>
-            </w:r>
-            <w:proofErr w:type="spellEnd"/>
-            <w:r>
-              <w:rPr>
-                <w:i/>
-                <w:iCs/>
-                <w:sz w:val="20"/>
-                <w:szCs w:val="20"/>
-              </w:rPr>
-              <w:t xml:space="preserve"> box</w:t>
+              <w:t>Área de la bounding box</w:t>
             </w:r>
           </w:p>
         </w:tc>
@@ -1952,7 +2279,7 @@
           </w:tcPr>
           <w:p>
             <w:pPr>
-              <w:pStyle w:val="HTMLconformatoprevio"/>
+              <w:pStyle w:val="HTMLPreformatted"/>
               <w:shd w:val="clear" w:color="auto" w:fill="FFFFFF"/>
               <w:wordWrap w:val="0"/>
               <w:jc w:val="center"/>
@@ -1963,6 +2290,14 @@
                 <w:szCs w:val="21"/>
               </w:rPr>
             </w:pPr>
+            <w:r>
+              <w:rPr>
+                <w:color w:val="000000"/>
+                <w:sz w:val="21"/>
+                <w:szCs w:val="21"/>
+              </w:rPr>
+              <w:t>41334.0</w:t>
+            </w:r>
           </w:p>
         </w:tc>
       </w:tr>
@@ -2003,7 +2338,7 @@
           </w:tcPr>
           <w:p>
             <w:pPr>
-              <w:pStyle w:val="HTMLconformatoprevio"/>
+              <w:pStyle w:val="HTMLPreformatted"/>
               <w:shd w:val="clear" w:color="auto" w:fill="FFFFFF"/>
               <w:wordWrap w:val="0"/>
               <w:jc w:val="center"/>
@@ -2014,6 +2349,14 @@
                 <w:szCs w:val="21"/>
               </w:rPr>
             </w:pPr>
+            <w:r>
+              <w:rPr>
+                <w:color w:val="000000"/>
+                <w:sz w:val="21"/>
+                <w:szCs w:val="21"/>
+              </w:rPr>
+              <w:t>31224.5</w:t>
+            </w:r>
           </w:p>
         </w:tc>
       </w:tr>
@@ -2054,7 +2397,7 @@
           </w:tcPr>
           <w:p>
             <w:pPr>
-              <w:pStyle w:val="HTMLconformatoprevio"/>
+              <w:pStyle w:val="HTMLPreformatted"/>
               <w:shd w:val="clear" w:color="auto" w:fill="FFFFFF"/>
               <w:wordWrap w:val="0"/>
               <w:jc w:val="center"/>
@@ -2065,6 +2408,14 @@
                 <w:szCs w:val="21"/>
               </w:rPr>
             </w:pPr>
+            <w:r>
+              <w:rPr>
+                <w:color w:val="000000"/>
+                <w:sz w:val="21"/>
+                <w:szCs w:val="21"/>
+              </w:rPr>
+              <w:t>0.8463</w:t>
+            </w:r>
           </w:p>
         </w:tc>
       </w:tr>
@@ -2105,7 +2456,7 @@
           </w:tcPr>
           <w:p>
             <w:pPr>
-              <w:pStyle w:val="HTMLconformatoprevio"/>
+              <w:pStyle w:val="HTMLPreformatted"/>
               <w:shd w:val="clear" w:color="auto" w:fill="FFFFFF"/>
               <w:wordWrap w:val="0"/>
               <w:jc w:val="center"/>
@@ -2116,6 +2467,14 @@
                 <w:szCs w:val="21"/>
               </w:rPr>
             </w:pPr>
+            <w:r>
+              <w:rPr>
+                <w:color w:val="000000"/>
+                <w:sz w:val="21"/>
+                <w:szCs w:val="21"/>
+              </w:rPr>
+              <w:t>136.1323</w:t>
+            </w:r>
           </w:p>
         </w:tc>
       </w:tr>
@@ -2156,7 +2515,7 @@
           </w:tcPr>
           <w:p>
             <w:pPr>
-              <w:pStyle w:val="HTMLconformatoprevio"/>
+              <w:pStyle w:val="HTMLPreformatted"/>
               <w:shd w:val="clear" w:color="auto" w:fill="FFFFFF"/>
               <w:wordWrap w:val="0"/>
               <w:jc w:val="center"/>
@@ -2167,6 +2526,14 @@
                 <w:szCs w:val="21"/>
               </w:rPr>
             </w:pPr>
+            <w:r>
+              <w:rPr>
+                <w:color w:val="000000"/>
+                <w:sz w:val="21"/>
+                <w:szCs w:val="21"/>
+              </w:rPr>
+              <w:t>0.3521</w:t>
+            </w:r>
           </w:p>
         </w:tc>
       </w:tr>
@@ -2195,19 +2562,8 @@
                 <w:sz w:val="20"/>
                 <w:szCs w:val="20"/>
               </w:rPr>
-              <w:t xml:space="preserve">Diámetro </w:t>
+              <w:t>Diámetro Feret</w:t>
             </w:r>
-            <w:proofErr w:type="spellStart"/>
-            <w:r>
-              <w:rPr>
-                <w:i/>
-                <w:iCs/>
-                <w:sz w:val="20"/>
-                <w:szCs w:val="20"/>
-              </w:rPr>
-              <w:t>Feret</w:t>
-            </w:r>
-            <w:proofErr w:type="spellEnd"/>
           </w:p>
         </w:tc>
         <w:tc>
@@ -2216,7 +2572,7 @@
           </w:tcPr>
           <w:p>
             <w:pPr>
-              <w:pStyle w:val="HTMLconformatoprevio"/>
+              <w:pStyle w:val="HTMLPreformatted"/>
               <w:shd w:val="clear" w:color="auto" w:fill="FFFFFF"/>
               <w:wordWrap w:val="0"/>
               <w:jc w:val="center"/>
@@ -2227,6 +2583,14 @@
                 <w:szCs w:val="21"/>
               </w:rPr>
             </w:pPr>
+            <w:r>
+              <w:rPr>
+                <w:color w:val="000000"/>
+                <w:sz w:val="21"/>
+                <w:szCs w:val="21"/>
+              </w:rPr>
+              <w:t>266.852</w:t>
+            </w:r>
           </w:p>
         </w:tc>
       </w:tr>
@@ -2267,7 +2631,7 @@
           </w:tcPr>
           <w:p>
             <w:pPr>
-              <w:pStyle w:val="HTMLconformatoprevio"/>
+              <w:pStyle w:val="HTMLPreformatted"/>
               <w:shd w:val="clear" w:color="auto" w:fill="FFFFFF"/>
               <w:wordWrap w:val="0"/>
               <w:jc w:val="center"/>
@@ -2278,6 +2642,14 @@
                 <w:szCs w:val="21"/>
               </w:rPr>
             </w:pPr>
+            <w:r>
+              <w:rPr>
+                <w:color w:val="000000"/>
+                <w:sz w:val="21"/>
+                <w:szCs w:val="21"/>
+              </w:rPr>
+              <w:t>242.8441</w:t>
+            </w:r>
           </w:p>
         </w:tc>
       </w:tr>
@@ -2318,7 +2690,7 @@
           </w:tcPr>
           <w:p>
             <w:pPr>
-              <w:pStyle w:val="HTMLconformatoprevio"/>
+              <w:pStyle w:val="HTMLPreformatted"/>
               <w:shd w:val="clear" w:color="auto" w:fill="FFFFFF"/>
               <w:wordWrap w:val="0"/>
               <w:jc w:val="center"/>
@@ -2329,6 +2701,14 @@
                 <w:szCs w:val="21"/>
               </w:rPr>
             </w:pPr>
+            <w:r>
+              <w:rPr>
+                <w:color w:val="000000"/>
+                <w:sz w:val="21"/>
+                <w:szCs w:val="21"/>
+              </w:rPr>
+              <w:t>129.3499</w:t>
+            </w:r>
           </w:p>
         </w:tc>
       </w:tr>
@@ -2369,7 +2749,7 @@
           </w:tcPr>
           <w:p>
             <w:pPr>
-              <w:pStyle w:val="HTMLconformatoprevio"/>
+              <w:pStyle w:val="HTMLPreformatted"/>
               <w:shd w:val="clear" w:color="auto" w:fill="FFFFFF"/>
               <w:wordWrap w:val="0"/>
               <w:jc w:val="center"/>
@@ -2380,6 +2760,14 @@
                 <w:szCs w:val="21"/>
               </w:rPr>
             </w:pPr>
+            <w:r>
+              <w:rPr>
+                <w:color w:val="000000"/>
+                <w:sz w:val="21"/>
+                <w:szCs w:val="21"/>
+              </w:rPr>
+              <w:t>1.0081</w:t>
+            </w:r>
           </w:p>
         </w:tc>
       </w:tr>
@@ -2420,7 +2808,7 @@
           </w:tcPr>
           <w:p>
             <w:pPr>
-              <w:pStyle w:val="HTMLconformatoprevio"/>
+              <w:pStyle w:val="HTMLPreformatted"/>
               <w:shd w:val="clear" w:color="auto" w:fill="FFFFFF"/>
               <w:wordWrap w:val="0"/>
               <w:jc w:val="center"/>
@@ -2431,6 +2819,14 @@
                 <w:szCs w:val="21"/>
               </w:rPr>
             </w:pPr>
+            <w:r>
+              <w:rPr>
+                <w:color w:val="000000"/>
+                <w:sz w:val="21"/>
+                <w:szCs w:val="21"/>
+              </w:rPr>
+              <w:t>1392.6215</w:t>
+            </w:r>
           </w:p>
         </w:tc>
       </w:tr>
@@ -2471,7 +2867,7 @@
           </w:tcPr>
           <w:p>
             <w:pPr>
-              <w:pStyle w:val="HTMLconformatoprevio"/>
+              <w:pStyle w:val="HTMLPreformatted"/>
               <w:shd w:val="clear" w:color="auto" w:fill="FFFFFF"/>
               <w:wordWrap w:val="0"/>
               <w:jc w:val="center"/>
@@ -2482,6 +2878,14 @@
                 <w:szCs w:val="21"/>
               </w:rPr>
             </w:pPr>
+            <w:r>
+              <w:rPr>
+                <w:color w:val="000000"/>
+                <w:sz w:val="21"/>
+                <w:szCs w:val="21"/>
+              </w:rPr>
+              <w:t>0.4615</w:t>
+            </w:r>
           </w:p>
         </w:tc>
       </w:tr>
@@ -2522,7 +2926,7 @@
           </w:tcPr>
           <w:p>
             <w:pPr>
-              <w:pStyle w:val="HTMLconformatoprevio"/>
+              <w:pStyle w:val="HTMLPreformatted"/>
               <w:shd w:val="clear" w:color="auto" w:fill="FFFFFF"/>
               <w:wordWrap w:val="0"/>
               <w:jc w:val="center"/>
@@ -2533,18 +2937,125 @@
                 <w:szCs w:val="21"/>
               </w:rPr>
             </w:pPr>
+            <w:r>
+              <w:rPr>
+                <w:color w:val="000000"/>
+                <w:sz w:val="21"/>
+                <w:szCs w:val="21"/>
+              </w:rPr>
+              <w:t>10.6034</w:t>
+            </w:r>
           </w:p>
         </w:tc>
       </w:tr>
     </w:tbl>
+    <w:p/>
     <w:p>
       <w:r>
-        <w:br w:type="page"/>
+        <w:rPr>
+          <w:b/>
+          <w:bCs/>
+        </w:rPr>
+        <w:drawing>
+          <wp:anchor distT="0" distB="0" distL="114300" distR="114300" simplePos="0" relativeHeight="251723776" behindDoc="0" locked="0" layoutInCell="1" allowOverlap="1" wp14:anchorId="46A92B36" wp14:editId="28E07C5B">
+            <wp:simplePos x="0" y="0"/>
+            <wp:positionH relativeFrom="margin">
+              <wp:posOffset>3691890</wp:posOffset>
+            </wp:positionH>
+            <wp:positionV relativeFrom="paragraph">
+              <wp:posOffset>737235</wp:posOffset>
+            </wp:positionV>
+            <wp:extent cx="1656080" cy="1190625"/>
+            <wp:effectExtent l="0" t="0" r="1270" b="9525"/>
+            <wp:wrapThrough wrapText="bothSides">
+              <wp:wrapPolygon edited="0">
+                <wp:start x="0" y="0"/>
+                <wp:lineTo x="0" y="21427"/>
+                <wp:lineTo x="21368" y="21427"/>
+                <wp:lineTo x="21368" y="0"/>
+                <wp:lineTo x="0" y="0"/>
+              </wp:wrapPolygon>
+            </wp:wrapThrough>
+            <wp:docPr id="101967065" name="Picture 1"/>
+            <wp:cNvGraphicFramePr>
+              <a:graphicFrameLocks xmlns:a="http://schemas.openxmlformats.org/drawingml/2006/main" noChangeAspect="1"/>
+            </wp:cNvGraphicFramePr>
+            <a:graphic xmlns:a="http://schemas.openxmlformats.org/drawingml/2006/main">
+              <a:graphicData uri="http://schemas.openxmlformats.org/drawingml/2006/picture">
+                <pic:pic xmlns:pic="http://schemas.openxmlformats.org/drawingml/2006/picture">
+                  <pic:nvPicPr>
+                    <pic:cNvPr id="101967065" name=""/>
+                    <pic:cNvPicPr/>
+                  </pic:nvPicPr>
+                  <pic:blipFill>
+                    <a:blip r:embed="rId13" cstate="print">
+                      <a:extLst>
+                        <a:ext uri="{28A0092B-C50C-407E-A947-70E740481C1C}">
+                          <a14:useLocalDpi xmlns:a14="http://schemas.microsoft.com/office/drawing/2010/main" val="0"/>
+                        </a:ext>
+                      </a:extLst>
+                    </a:blip>
+                    <a:stretch>
+                      <a:fillRect/>
+                    </a:stretch>
+                  </pic:blipFill>
+                  <pic:spPr>
+                    <a:xfrm>
+                      <a:off x="0" y="0"/>
+                      <a:ext cx="1656080" cy="1190625"/>
+                    </a:xfrm>
+                    <a:prstGeom prst="rect">
+                      <a:avLst/>
+                    </a:prstGeom>
+                  </pic:spPr>
+                </pic:pic>
+              </a:graphicData>
+            </a:graphic>
+            <wp14:sizeRelH relativeFrom="margin">
+              <wp14:pctWidth>0</wp14:pctWidth>
+            </wp14:sizeRelH>
+            <wp14:sizeRelV relativeFrom="margin">
+              <wp14:pctHeight>0</wp14:pctHeight>
+            </wp14:sizeRelV>
+          </wp:anchor>
+        </w:drawing>
       </w:r>
     </w:p>
     <w:p>
       <w:pPr>
-        <w:pStyle w:val="Prrafodelista"/>
+        <w:tabs>
+          <w:tab w:val="left" w:pos="6405"/>
+        </w:tabs>
+      </w:pPr>
+      <w:r>
+        <w:tab/>
+      </w:r>
+    </w:p>
+    <w:p>
+      <w:pPr>
+        <w:tabs>
+          <w:tab w:val="left" w:pos="6405"/>
+        </w:tabs>
+      </w:pPr>
+    </w:p>
+    <w:p>
+      <w:pPr>
+        <w:tabs>
+          <w:tab w:val="left" w:pos="6405"/>
+        </w:tabs>
+      </w:pPr>
+    </w:p>
+    <w:p>
+      <w:pPr>
+        <w:tabs>
+          <w:tab w:val="left" w:pos="6405"/>
+        </w:tabs>
+      </w:pPr>
+    </w:p>
+    <w:p/>
+    <w:p>
+      <w:pPr>
+        <w:pStyle w:val="ListParagraph"/>
         <w:numPr>
           <w:ilvl w:val="0"/>
           <w:numId w:val="1"/>
@@ -2580,7 +3091,7 @@
     </w:p>
     <w:tbl>
       <w:tblPr>
-        <w:tblStyle w:val="Tablaconcuadrcula"/>
+        <w:tblStyle w:val="TableGrid"/>
         <w:tblpPr w:leftFromText="141" w:rightFromText="141" w:vertAnchor="text" w:horzAnchor="margin" w:tblpY="8517"/>
         <w:tblW w:w="0" w:type="auto"/>
         <w:tblLook w:val="04A0" w:firstRow="1" w:lastRow="0" w:firstColumn="1" w:lastColumn="0" w:noHBand="0" w:noVBand="1"/>
@@ -2673,7 +3184,7 @@
           </w:tcPr>
           <w:p>
             <w:pPr>
-              <w:pStyle w:val="HTMLconformatoprevio"/>
+              <w:pStyle w:val="HTMLPreformatted"/>
               <w:shd w:val="clear" w:color="auto" w:fill="FFFFFF"/>
               <w:wordWrap w:val="0"/>
               <w:jc w:val="center"/>
@@ -2684,6 +3195,14 @@
                 <w:szCs w:val="21"/>
               </w:rPr>
             </w:pPr>
+            <w:r>
+              <w:rPr>
+                <w:color w:val="000000"/>
+                <w:sz w:val="21"/>
+                <w:szCs w:val="21"/>
+              </w:rPr>
+              <w:t>4921.0</w:t>
+            </w:r>
           </w:p>
         </w:tc>
       </w:tr>
@@ -2714,27 +3233,7 @@
                 <w:sz w:val="20"/>
                 <w:szCs w:val="20"/>
               </w:rPr>
-              <w:t xml:space="preserve">Área de la </w:t>
-            </w:r>
-            <w:proofErr w:type="spellStart"/>
-            <w:r>
-              <w:rPr>
-                <w:i/>
-                <w:iCs/>
-                <w:sz w:val="20"/>
-                <w:szCs w:val="20"/>
-              </w:rPr>
-              <w:t>bounding</w:t>
-            </w:r>
-            <w:proofErr w:type="spellEnd"/>
-            <w:r>
-              <w:rPr>
-                <w:i/>
-                <w:iCs/>
-                <w:sz w:val="20"/>
-                <w:szCs w:val="20"/>
-              </w:rPr>
-              <w:t xml:space="preserve"> box</w:t>
+              <w:t>Área de la bounding box</w:t>
             </w:r>
           </w:p>
         </w:tc>
@@ -2744,7 +3243,7 @@
           </w:tcPr>
           <w:p>
             <w:pPr>
-              <w:pStyle w:val="HTMLconformatoprevio"/>
+              <w:pStyle w:val="HTMLPreformatted"/>
               <w:shd w:val="clear" w:color="auto" w:fill="FFFFFF"/>
               <w:wordWrap w:val="0"/>
               <w:jc w:val="center"/>
@@ -2755,6 +3254,14 @@
                 <w:szCs w:val="21"/>
               </w:rPr>
             </w:pPr>
+            <w:r>
+              <w:rPr>
+                <w:color w:val="000000"/>
+                <w:sz w:val="21"/>
+                <w:szCs w:val="21"/>
+              </w:rPr>
+              <w:t>7663.0</w:t>
+            </w:r>
           </w:p>
         </w:tc>
       </w:tr>
@@ -2795,7 +3302,7 @@
           </w:tcPr>
           <w:p>
             <w:pPr>
-              <w:pStyle w:val="HTMLconformatoprevio"/>
+              <w:pStyle w:val="HTMLPreformatted"/>
               <w:shd w:val="clear" w:color="auto" w:fill="FFFFFF"/>
               <w:wordWrap w:val="0"/>
               <w:jc w:val="center"/>
@@ -2806,6 +3313,14 @@
                 <w:szCs w:val="21"/>
               </w:rPr>
             </w:pPr>
+            <w:r>
+              <w:rPr>
+                <w:color w:val="000000"/>
+                <w:sz w:val="21"/>
+                <w:szCs w:val="21"/>
+              </w:rPr>
+              <w:t>4942.0</w:t>
+            </w:r>
           </w:p>
         </w:tc>
       </w:tr>
@@ -2846,8 +3361,11 @@
           </w:tcPr>
           <w:p>
             <w:pPr>
-              <w:pStyle w:val="HTMLconformatoprevio"/>
+              <w:pStyle w:val="HTMLPreformatted"/>
               <w:shd w:val="clear" w:color="auto" w:fill="FFFFFF"/>
+              <w:tabs>
+                <w:tab w:val="left" w:pos="1215"/>
+              </w:tabs>
               <w:wordWrap w:val="0"/>
               <w:jc w:val="center"/>
               <w:textAlignment w:val="baseline"/>
@@ -2857,6 +3375,14 @@
                 <w:szCs w:val="21"/>
               </w:rPr>
             </w:pPr>
+            <w:r>
+              <w:rPr>
+                <w:color w:val="000000"/>
+                <w:sz w:val="21"/>
+                <w:szCs w:val="21"/>
+              </w:rPr>
+              <w:t>0.8345</w:t>
+            </w:r>
           </w:p>
         </w:tc>
       </w:tr>
@@ -2897,7 +3423,7 @@
           </w:tcPr>
           <w:p>
             <w:pPr>
-              <w:pStyle w:val="HTMLconformatoprevio"/>
+              <w:pStyle w:val="HTMLPreformatted"/>
               <w:shd w:val="clear" w:color="auto" w:fill="FFFFFF"/>
               <w:wordWrap w:val="0"/>
               <w:jc w:val="center"/>
@@ -2908,6 +3434,14 @@
                 <w:szCs w:val="21"/>
               </w:rPr>
             </w:pPr>
+            <w:r>
+              <w:rPr>
+                <w:color w:val="000000"/>
+                <w:sz w:val="21"/>
+                <w:szCs w:val="21"/>
+              </w:rPr>
+              <w:t>79.1556</w:t>
+            </w:r>
           </w:p>
         </w:tc>
       </w:tr>
@@ -2948,7 +3482,7 @@
           </w:tcPr>
           <w:p>
             <w:pPr>
-              <w:pStyle w:val="HTMLconformatoprevio"/>
+              <w:pStyle w:val="HTMLPreformatted"/>
               <w:shd w:val="clear" w:color="auto" w:fill="FFFFFF"/>
               <w:wordWrap w:val="0"/>
               <w:jc w:val="center"/>
@@ -2959,6 +3493,14 @@
                 <w:szCs w:val="21"/>
               </w:rPr>
             </w:pPr>
+            <w:r>
+              <w:rPr>
+                <w:color w:val="000000"/>
+                <w:sz w:val="21"/>
+                <w:szCs w:val="21"/>
+              </w:rPr>
+              <w:t>0.6422</w:t>
+            </w:r>
           </w:p>
         </w:tc>
       </w:tr>
@@ -2989,19 +3531,8 @@
                 <w:sz w:val="20"/>
                 <w:szCs w:val="20"/>
               </w:rPr>
-              <w:t xml:space="preserve">Diámetro </w:t>
+              <w:t>Diámetro Feret</w:t>
             </w:r>
-            <w:proofErr w:type="spellStart"/>
-            <w:r>
-              <w:rPr>
-                <w:i/>
-                <w:iCs/>
-                <w:sz w:val="20"/>
-                <w:szCs w:val="20"/>
-              </w:rPr>
-              <w:t>Feret</w:t>
-            </w:r>
-            <w:proofErr w:type="spellEnd"/>
           </w:p>
         </w:tc>
         <w:tc>
@@ -3010,7 +3541,7 @@
           </w:tcPr>
           <w:p>
             <w:pPr>
-              <w:pStyle w:val="HTMLconformatoprevio"/>
+              <w:pStyle w:val="HTMLPreformatted"/>
               <w:shd w:val="clear" w:color="auto" w:fill="FFFFFF"/>
               <w:wordWrap w:val="0"/>
               <w:jc w:val="center"/>
@@ -3021,6 +3552,14 @@
                 <w:szCs w:val="21"/>
               </w:rPr>
             </w:pPr>
+            <w:r>
+              <w:rPr>
+                <w:color w:val="000000"/>
+                <w:sz w:val="21"/>
+                <w:szCs w:val="21"/>
+              </w:rPr>
+              <w:t>104.8094</w:t>
+            </w:r>
           </w:p>
         </w:tc>
       </w:tr>
@@ -3061,7 +3600,7 @@
           </w:tcPr>
           <w:p>
             <w:pPr>
-              <w:pStyle w:val="HTMLconformatoprevio"/>
+              <w:pStyle w:val="HTMLPreformatted"/>
               <w:shd w:val="clear" w:color="auto" w:fill="FFFFFF"/>
               <w:wordWrap w:val="0"/>
               <w:jc w:val="center"/>
@@ -3072,6 +3611,14 @@
                 <w:szCs w:val="21"/>
               </w:rPr>
             </w:pPr>
+            <w:r>
+              <w:rPr>
+                <w:color w:val="000000"/>
+                <w:sz w:val="21"/>
+                <w:szCs w:val="21"/>
+              </w:rPr>
+              <w:t>106.8939</w:t>
+            </w:r>
           </w:p>
         </w:tc>
       </w:tr>
@@ -3112,7 +3659,7 @@
           </w:tcPr>
           <w:p>
             <w:pPr>
-              <w:pStyle w:val="HTMLconformatoprevio"/>
+              <w:pStyle w:val="HTMLPreformatted"/>
               <w:shd w:val="clear" w:color="auto" w:fill="FFFFFF"/>
               <w:wordWrap w:val="0"/>
               <w:jc w:val="center"/>
@@ -3123,6 +3670,14 @@
                 <w:szCs w:val="21"/>
               </w:rPr>
             </w:pPr>
+            <w:r>
+              <w:rPr>
+                <w:color w:val="000000"/>
+                <w:sz w:val="21"/>
+                <w:szCs w:val="21"/>
+              </w:rPr>
+              <w:t>58.8919</w:t>
+            </w:r>
           </w:p>
         </w:tc>
       </w:tr>
@@ -3163,7 +3718,7 @@
           </w:tcPr>
           <w:p>
             <w:pPr>
-              <w:pStyle w:val="HTMLconformatoprevio"/>
+              <w:pStyle w:val="HTMLPreformatted"/>
               <w:shd w:val="clear" w:color="auto" w:fill="FFFFFF"/>
               <w:wordWrap w:val="0"/>
               <w:jc w:val="center"/>
@@ -3174,6 +3729,14 @@
                 <w:szCs w:val="21"/>
               </w:rPr>
             </w:pPr>
+            <w:r>
+              <w:rPr>
+                <w:color w:val="000000"/>
+                <w:sz w:val="21"/>
+                <w:szCs w:val="21"/>
+              </w:rPr>
+              <w:t>-0.5593</w:t>
+            </w:r>
           </w:p>
         </w:tc>
       </w:tr>
@@ -3214,7 +3777,7 @@
           </w:tcPr>
           <w:p>
             <w:pPr>
-              <w:pStyle w:val="HTMLconformatoprevio"/>
+              <w:pStyle w:val="HTMLPreformatted"/>
               <w:shd w:val="clear" w:color="auto" w:fill="FFFFFF"/>
               <w:wordWrap w:val="0"/>
               <w:jc w:val="center"/>
@@ -3225,6 +3788,14 @@
                 <w:szCs w:val="21"/>
               </w:rPr>
             </w:pPr>
+            <w:r>
+              <w:rPr>
+                <w:color w:val="000000"/>
+                <w:sz w:val="21"/>
+                <w:szCs w:val="21"/>
+              </w:rPr>
+              <w:t>282.0488</w:t>
+            </w:r>
           </w:p>
         </w:tc>
       </w:tr>
@@ -3265,7 +3836,7 @@
           </w:tcPr>
           <w:p>
             <w:pPr>
-              <w:pStyle w:val="HTMLconformatoprevio"/>
+              <w:pStyle w:val="HTMLPreformatted"/>
               <w:shd w:val="clear" w:color="auto" w:fill="FFFFFF"/>
               <w:wordWrap w:val="0"/>
               <w:jc w:val="center"/>
@@ -3276,6 +3847,14 @@
                 <w:szCs w:val="21"/>
               </w:rPr>
             </w:pPr>
+            <w:r>
+              <w:rPr>
+                <w:color w:val="000000"/>
+                <w:sz w:val="21"/>
+                <w:szCs w:val="21"/>
+              </w:rPr>
+              <w:t>0.9714</w:t>
+            </w:r>
           </w:p>
         </w:tc>
       </w:tr>
@@ -3316,7 +3895,7 @@
           </w:tcPr>
           <w:p>
             <w:pPr>
-              <w:pStyle w:val="HTMLconformatoprevio"/>
+              <w:pStyle w:val="HTMLPreformatted"/>
               <w:shd w:val="clear" w:color="auto" w:fill="FFFFFF"/>
               <w:wordWrap w:val="0"/>
               <w:jc w:val="center"/>
@@ -3327,6 +3906,14 @@
                 <w:szCs w:val="21"/>
               </w:rPr>
             </w:pPr>
+            <w:r>
+              <w:rPr>
+                <w:color w:val="000000"/>
+                <w:sz w:val="21"/>
+                <w:szCs w:val="21"/>
+              </w:rPr>
+              <w:t>1.2864</w:t>
+            </w:r>
           </w:p>
         </w:tc>
       </w:tr>
@@ -3340,6 +3927,201 @@
         </w:rPr>
       </w:pPr>
       <w:r>
+        <w:drawing>
+          <wp:anchor distT="0" distB="0" distL="114300" distR="114300" simplePos="0" relativeHeight="251726848" behindDoc="0" locked="0" layoutInCell="1" allowOverlap="1" wp14:anchorId="4E136687" wp14:editId="5EDD48F2">
+            <wp:simplePos x="0" y="0"/>
+            <wp:positionH relativeFrom="column">
+              <wp:posOffset>3810635</wp:posOffset>
+            </wp:positionH>
+            <wp:positionV relativeFrom="paragraph">
+              <wp:posOffset>552450</wp:posOffset>
+            </wp:positionV>
+            <wp:extent cx="1562100" cy="1682115"/>
+            <wp:effectExtent l="0" t="0" r="0" b="0"/>
+            <wp:wrapThrough wrapText="bothSides">
+              <wp:wrapPolygon edited="0">
+                <wp:start x="0" y="0"/>
+                <wp:lineTo x="0" y="21282"/>
+                <wp:lineTo x="21337" y="21282"/>
+                <wp:lineTo x="21337" y="0"/>
+                <wp:lineTo x="0" y="0"/>
+              </wp:wrapPolygon>
+            </wp:wrapThrough>
+            <wp:docPr id="1998153099" name="Picture 1"/>
+            <wp:cNvGraphicFramePr>
+              <a:graphicFrameLocks xmlns:a="http://schemas.openxmlformats.org/drawingml/2006/main" noChangeAspect="1"/>
+            </wp:cNvGraphicFramePr>
+            <a:graphic xmlns:a="http://schemas.openxmlformats.org/drawingml/2006/main">
+              <a:graphicData uri="http://schemas.openxmlformats.org/drawingml/2006/picture">
+                <pic:pic xmlns:pic="http://schemas.openxmlformats.org/drawingml/2006/picture">
+                  <pic:nvPicPr>
+                    <pic:cNvPr id="1998153099" name=""/>
+                    <pic:cNvPicPr/>
+                  </pic:nvPicPr>
+                  <pic:blipFill>
+                    <a:blip r:embed="rId14">
+                      <a:extLst>
+                        <a:ext uri="{28A0092B-C50C-407E-A947-70E740481C1C}">
+                          <a14:useLocalDpi xmlns:a14="http://schemas.microsoft.com/office/drawing/2010/main" val="0"/>
+                        </a:ext>
+                      </a:extLst>
+                    </a:blip>
+                    <a:stretch>
+                      <a:fillRect/>
+                    </a:stretch>
+                  </pic:blipFill>
+                  <pic:spPr>
+                    <a:xfrm>
+                      <a:off x="0" y="0"/>
+                      <a:ext cx="1562100" cy="1682115"/>
+                    </a:xfrm>
+                    <a:prstGeom prst="rect">
+                      <a:avLst/>
+                    </a:prstGeom>
+                  </pic:spPr>
+                </pic:pic>
+              </a:graphicData>
+            </a:graphic>
+            <wp14:sizeRelH relativeFrom="margin">
+              <wp14:pctWidth>0</wp14:pctWidth>
+            </wp14:sizeRelH>
+            <wp14:sizeRelV relativeFrom="margin">
+              <wp14:pctHeight>0</wp14:pctHeight>
+            </wp14:sizeRelV>
+          </wp:anchor>
+        </w:drawing>
+      </w:r>
+      <w:r>
+        <w:drawing>
+          <wp:anchor distT="0" distB="0" distL="114300" distR="114300" simplePos="0" relativeHeight="251725824" behindDoc="0" locked="0" layoutInCell="1" allowOverlap="1" wp14:anchorId="163ECBF1" wp14:editId="3F90CF4F">
+            <wp:simplePos x="0" y="0"/>
+            <wp:positionH relativeFrom="margin">
+              <wp:align>center</wp:align>
+            </wp:positionH>
+            <wp:positionV relativeFrom="paragraph">
+              <wp:posOffset>558165</wp:posOffset>
+            </wp:positionV>
+            <wp:extent cx="1543050" cy="1641475"/>
+            <wp:effectExtent l="0" t="0" r="0" b="0"/>
+            <wp:wrapThrough wrapText="bothSides">
+              <wp:wrapPolygon edited="0">
+                <wp:start x="0" y="0"/>
+                <wp:lineTo x="0" y="21308"/>
+                <wp:lineTo x="21333" y="21308"/>
+                <wp:lineTo x="21333" y="0"/>
+                <wp:lineTo x="0" y="0"/>
+              </wp:wrapPolygon>
+            </wp:wrapThrough>
+            <wp:docPr id="282626651" name="Picture 1"/>
+            <wp:cNvGraphicFramePr>
+              <a:graphicFrameLocks xmlns:a="http://schemas.openxmlformats.org/drawingml/2006/main" noChangeAspect="1"/>
+            </wp:cNvGraphicFramePr>
+            <a:graphic xmlns:a="http://schemas.openxmlformats.org/drawingml/2006/main">
+              <a:graphicData uri="http://schemas.openxmlformats.org/drawingml/2006/picture">
+                <pic:pic xmlns:pic="http://schemas.openxmlformats.org/drawingml/2006/picture">
+                  <pic:nvPicPr>
+                    <pic:cNvPr id="282626651" name=""/>
+                    <pic:cNvPicPr/>
+                  </pic:nvPicPr>
+                  <pic:blipFill>
+                    <a:blip r:embed="rId15" cstate="print">
+                      <a:extLst>
+                        <a:ext uri="{28A0092B-C50C-407E-A947-70E740481C1C}">
+                          <a14:useLocalDpi xmlns:a14="http://schemas.microsoft.com/office/drawing/2010/main" val="0"/>
+                        </a:ext>
+                      </a:extLst>
+                    </a:blip>
+                    <a:stretch>
+                      <a:fillRect/>
+                    </a:stretch>
+                  </pic:blipFill>
+                  <pic:spPr>
+                    <a:xfrm>
+                      <a:off x="0" y="0"/>
+                      <a:ext cx="1543050" cy="1641475"/>
+                    </a:xfrm>
+                    <a:prstGeom prst="rect">
+                      <a:avLst/>
+                    </a:prstGeom>
+                  </pic:spPr>
+                </pic:pic>
+              </a:graphicData>
+            </a:graphic>
+            <wp14:sizeRelH relativeFrom="margin">
+              <wp14:pctWidth>0</wp14:pctWidth>
+            </wp14:sizeRelH>
+            <wp14:sizeRelV relativeFrom="margin">
+              <wp14:pctHeight>0</wp14:pctHeight>
+            </wp14:sizeRelV>
+          </wp:anchor>
+        </w:drawing>
+      </w:r>
+      <w:r>
+        <w:drawing>
+          <wp:anchor distT="0" distB="0" distL="114300" distR="114300" simplePos="0" relativeHeight="251724800" behindDoc="0" locked="0" layoutInCell="1" allowOverlap="1" wp14:anchorId="48B4F4E0" wp14:editId="6D099485">
+            <wp:simplePos x="0" y="0"/>
+            <wp:positionH relativeFrom="column">
+              <wp:posOffset>43180</wp:posOffset>
+            </wp:positionH>
+            <wp:positionV relativeFrom="paragraph">
+              <wp:posOffset>561975</wp:posOffset>
+            </wp:positionV>
+            <wp:extent cx="1631315" cy="1626235"/>
+            <wp:effectExtent l="0" t="0" r="6985" b="0"/>
+            <wp:wrapThrough wrapText="bothSides">
+              <wp:wrapPolygon edited="0">
+                <wp:start x="0" y="0"/>
+                <wp:lineTo x="0" y="21254"/>
+                <wp:lineTo x="21440" y="21254"/>
+                <wp:lineTo x="21440" y="0"/>
+                <wp:lineTo x="0" y="0"/>
+              </wp:wrapPolygon>
+            </wp:wrapThrough>
+            <wp:docPr id="499952857" name="Picture 1"/>
+            <wp:cNvGraphicFramePr>
+              <a:graphicFrameLocks xmlns:a="http://schemas.openxmlformats.org/drawingml/2006/main" noChangeAspect="1"/>
+            </wp:cNvGraphicFramePr>
+            <a:graphic xmlns:a="http://schemas.openxmlformats.org/drawingml/2006/main">
+              <a:graphicData uri="http://schemas.openxmlformats.org/drawingml/2006/picture">
+                <pic:pic xmlns:pic="http://schemas.openxmlformats.org/drawingml/2006/picture">
+                  <pic:nvPicPr>
+                    <pic:cNvPr id="499952857" name=""/>
+                    <pic:cNvPicPr/>
+                  </pic:nvPicPr>
+                  <pic:blipFill>
+                    <a:blip r:embed="rId16">
+                      <a:extLst>
+                        <a:ext uri="{28A0092B-C50C-407E-A947-70E740481C1C}">
+                          <a14:useLocalDpi xmlns:a14="http://schemas.microsoft.com/office/drawing/2010/main" val="0"/>
+                        </a:ext>
+                      </a:extLst>
+                    </a:blip>
+                    <a:stretch>
+                      <a:fillRect/>
+                    </a:stretch>
+                  </pic:blipFill>
+                  <pic:spPr>
+                    <a:xfrm>
+                      <a:off x="0" y="0"/>
+                      <a:ext cx="1631315" cy="1626235"/>
+                    </a:xfrm>
+                    <a:prstGeom prst="rect">
+                      <a:avLst/>
+                    </a:prstGeom>
+                  </pic:spPr>
+                </pic:pic>
+              </a:graphicData>
+            </a:graphic>
+            <wp14:sizeRelH relativeFrom="margin">
+              <wp14:pctWidth>0</wp14:pctWidth>
+            </wp14:sizeRelH>
+            <wp14:sizeRelV relativeFrom="margin">
+              <wp14:pctHeight>0</wp14:pctHeight>
+            </wp14:sizeRelV>
+          </wp:anchor>
+        </w:drawing>
+      </w:r>
+      <w:r>
         <w:rPr>
           <w:b/>
           <w:bCs/>
@@ -3348,7 +4130,7 @@
         <mc:AlternateContent>
           <mc:Choice Requires="wps">
             <w:drawing>
-              <wp:anchor distT="45720" distB="45720" distL="114300" distR="114300" simplePos="0" relativeHeight="251706368" behindDoc="0" locked="0" layoutInCell="1" allowOverlap="1" wp14:anchorId="6653CCA1" wp14:editId="492C0AB9">
+              <wp:anchor distT="45720" distB="45720" distL="114300" distR="114300" simplePos="0" relativeHeight="251706368" behindDoc="0" locked="0" layoutInCell="1" allowOverlap="1" wp14:anchorId="6653CCA1" wp14:editId="5B32A152">
                 <wp:simplePos x="0" y="0"/>
                 <wp:positionH relativeFrom="margin">
                   <wp:posOffset>3682365</wp:posOffset>
@@ -3591,13 +4373,8 @@
                             <w:pPr>
                               <w:jc w:val="center"/>
                             </w:pPr>
-                            <w:proofErr w:type="spellStart"/>
                             <w:r>
-                              <w:t>Crop</w:t>
-                            </w:r>
-                            <w:proofErr w:type="spellEnd"/>
-                            <w:r>
-                              <w:t xml:space="preserve"> del mayor lumen</w:t>
+                              <w:t>Crop del mayor lumen</w:t>
                             </w:r>
                             <w:r>
                               <w:t xml:space="preserve"> #7</w:t>
@@ -4649,7 +5426,224 @@
       </w:r>
     </w:p>
     <w:p/>
-    <w:p/>
+    <w:p>
+      <w:r>
+        <w:rPr>
+          <w:noProof/>
+        </w:rPr>
+        <w:drawing>
+          <wp:anchor distT="0" distB="0" distL="114300" distR="114300" simplePos="0" relativeHeight="251729920" behindDoc="0" locked="0" layoutInCell="1" allowOverlap="1" wp14:anchorId="3C5315C2" wp14:editId="0266DF4A">
+            <wp:simplePos x="0" y="0"/>
+            <wp:positionH relativeFrom="margin">
+              <wp:posOffset>3767455</wp:posOffset>
+            </wp:positionH>
+            <wp:positionV relativeFrom="paragraph">
+              <wp:posOffset>544195</wp:posOffset>
+            </wp:positionV>
+            <wp:extent cx="1533525" cy="1639570"/>
+            <wp:effectExtent l="0" t="0" r="9525" b="0"/>
+            <wp:wrapThrough wrapText="bothSides">
+              <wp:wrapPolygon edited="0">
+                <wp:start x="0" y="0"/>
+                <wp:lineTo x="0" y="21332"/>
+                <wp:lineTo x="21466" y="21332"/>
+                <wp:lineTo x="21466" y="0"/>
+                <wp:lineTo x="0" y="0"/>
+              </wp:wrapPolygon>
+            </wp:wrapThrough>
+            <wp:docPr id="760669878" name="Picture 33"/>
+            <wp:cNvGraphicFramePr>
+              <a:graphicFrameLocks xmlns:a="http://schemas.openxmlformats.org/drawingml/2006/main" noChangeAspect="1"/>
+            </wp:cNvGraphicFramePr>
+            <a:graphic xmlns:a="http://schemas.openxmlformats.org/drawingml/2006/main">
+              <a:graphicData uri="http://schemas.openxmlformats.org/drawingml/2006/picture">
+                <pic:pic xmlns:pic="http://schemas.openxmlformats.org/drawingml/2006/picture">
+                  <pic:nvPicPr>
+                    <pic:cNvPr id="0" name="Picture 6"/>
+                    <pic:cNvPicPr>
+                      <a:picLocks noChangeAspect="1" noChangeArrowheads="1"/>
+                    </pic:cNvPicPr>
+                  </pic:nvPicPr>
+                  <pic:blipFill>
+                    <a:blip r:embed="rId17" cstate="print">
+                      <a:extLst>
+                        <a:ext uri="{28A0092B-C50C-407E-A947-70E740481C1C}">
+                          <a14:useLocalDpi xmlns:a14="http://schemas.microsoft.com/office/drawing/2010/main" val="0"/>
+                        </a:ext>
+                      </a:extLst>
+                    </a:blip>
+                    <a:srcRect/>
+                    <a:stretch>
+                      <a:fillRect/>
+                    </a:stretch>
+                  </pic:blipFill>
+                  <pic:spPr bwMode="auto">
+                    <a:xfrm>
+                      <a:off x="0" y="0"/>
+                      <a:ext cx="1533525" cy="1639570"/>
+                    </a:xfrm>
+                    <a:prstGeom prst="rect">
+                      <a:avLst/>
+                    </a:prstGeom>
+                    <a:noFill/>
+                  </pic:spPr>
+                </pic:pic>
+              </a:graphicData>
+            </a:graphic>
+            <wp14:sizeRelH relativeFrom="margin">
+              <wp14:pctWidth>0</wp14:pctWidth>
+            </wp14:sizeRelH>
+            <wp14:sizeRelV relativeFrom="margin">
+              <wp14:pctHeight>0</wp14:pctHeight>
+            </wp14:sizeRelV>
+          </wp:anchor>
+        </w:drawing>
+      </w:r>
+      <w:r>
+        <w:rPr>
+          <w:noProof/>
+        </w:rPr>
+        <w:drawing>
+          <wp:anchor distT="0" distB="0" distL="114300" distR="114300" simplePos="0" relativeHeight="251728896" behindDoc="0" locked="0" layoutInCell="1" allowOverlap="1" wp14:anchorId="7935FBDD" wp14:editId="6A2AAE20">
+            <wp:simplePos x="0" y="0"/>
+            <wp:positionH relativeFrom="margin">
+              <wp:align>center</wp:align>
+            </wp:positionH>
+            <wp:positionV relativeFrom="paragraph">
+              <wp:posOffset>554355</wp:posOffset>
+            </wp:positionV>
+            <wp:extent cx="1519555" cy="1634490"/>
+            <wp:effectExtent l="0" t="0" r="4445" b="3810"/>
+            <wp:wrapThrough wrapText="bothSides">
+              <wp:wrapPolygon edited="0">
+                <wp:start x="0" y="0"/>
+                <wp:lineTo x="0" y="21399"/>
+                <wp:lineTo x="21392" y="21399"/>
+                <wp:lineTo x="21392" y="0"/>
+                <wp:lineTo x="0" y="0"/>
+              </wp:wrapPolygon>
+            </wp:wrapThrough>
+            <wp:docPr id="1125143825" name="Picture 32"/>
+            <wp:cNvGraphicFramePr>
+              <a:graphicFrameLocks xmlns:a="http://schemas.openxmlformats.org/drawingml/2006/main" noChangeAspect="1"/>
+            </wp:cNvGraphicFramePr>
+            <a:graphic xmlns:a="http://schemas.openxmlformats.org/drawingml/2006/main">
+              <a:graphicData uri="http://schemas.openxmlformats.org/drawingml/2006/picture">
+                <pic:pic xmlns:pic="http://schemas.openxmlformats.org/drawingml/2006/picture">
+                  <pic:nvPicPr>
+                    <pic:cNvPr id="0" name="Picture 5"/>
+                    <pic:cNvPicPr>
+                      <a:picLocks noChangeAspect="1" noChangeArrowheads="1"/>
+                    </pic:cNvPicPr>
+                  </pic:nvPicPr>
+                  <pic:blipFill>
+                    <a:blip r:embed="rId18" cstate="print">
+                      <a:extLst>
+                        <a:ext uri="{28A0092B-C50C-407E-A947-70E740481C1C}">
+                          <a14:useLocalDpi xmlns:a14="http://schemas.microsoft.com/office/drawing/2010/main" val="0"/>
+                        </a:ext>
+                      </a:extLst>
+                    </a:blip>
+                    <a:srcRect/>
+                    <a:stretch>
+                      <a:fillRect/>
+                    </a:stretch>
+                  </pic:blipFill>
+                  <pic:spPr bwMode="auto">
+                    <a:xfrm>
+                      <a:off x="0" y="0"/>
+                      <a:ext cx="1519555" cy="1634490"/>
+                    </a:xfrm>
+                    <a:prstGeom prst="rect">
+                      <a:avLst/>
+                    </a:prstGeom>
+                    <a:noFill/>
+                  </pic:spPr>
+                </pic:pic>
+              </a:graphicData>
+            </a:graphic>
+            <wp14:sizeRelH relativeFrom="margin">
+              <wp14:pctWidth>0</wp14:pctWidth>
+            </wp14:sizeRelH>
+            <wp14:sizeRelV relativeFrom="margin">
+              <wp14:pctHeight>0</wp14:pctHeight>
+            </wp14:sizeRelV>
+          </wp:anchor>
+        </w:drawing>
+      </w:r>
+      <w:r>
+        <w:rPr>
+          <w:noProof/>
+        </w:rPr>
+        <w:drawing>
+          <wp:anchor distT="0" distB="0" distL="114300" distR="114300" simplePos="0" relativeHeight="251727872" behindDoc="0" locked="0" layoutInCell="1" allowOverlap="1" wp14:anchorId="3CF8AF67" wp14:editId="71BBDEA6">
+            <wp:simplePos x="0" y="0"/>
+            <wp:positionH relativeFrom="column">
+              <wp:posOffset>110490</wp:posOffset>
+            </wp:positionH>
+            <wp:positionV relativeFrom="paragraph">
+              <wp:posOffset>521335</wp:posOffset>
+            </wp:positionV>
+            <wp:extent cx="1521460" cy="1705610"/>
+            <wp:effectExtent l="0" t="0" r="2540" b="8890"/>
+            <wp:wrapThrough wrapText="bothSides">
+              <wp:wrapPolygon edited="0">
+                <wp:start x="0" y="0"/>
+                <wp:lineTo x="0" y="21471"/>
+                <wp:lineTo x="21366" y="21471"/>
+                <wp:lineTo x="21366" y="0"/>
+                <wp:lineTo x="0" y="0"/>
+              </wp:wrapPolygon>
+            </wp:wrapThrough>
+            <wp:docPr id="13686638" name="Picture 31"/>
+            <wp:cNvGraphicFramePr>
+              <a:graphicFrameLocks xmlns:a="http://schemas.openxmlformats.org/drawingml/2006/main" noChangeAspect="1"/>
+            </wp:cNvGraphicFramePr>
+            <a:graphic xmlns:a="http://schemas.openxmlformats.org/drawingml/2006/main">
+              <a:graphicData uri="http://schemas.openxmlformats.org/drawingml/2006/picture">
+                <pic:pic xmlns:pic="http://schemas.openxmlformats.org/drawingml/2006/picture">
+                  <pic:nvPicPr>
+                    <pic:cNvPr id="0" name="Picture 4"/>
+                    <pic:cNvPicPr>
+                      <a:picLocks noChangeAspect="1" noChangeArrowheads="1"/>
+                    </pic:cNvPicPr>
+                  </pic:nvPicPr>
+                  <pic:blipFill>
+                    <a:blip r:embed="rId19">
+                      <a:extLst>
+                        <a:ext uri="{28A0092B-C50C-407E-A947-70E740481C1C}">
+                          <a14:useLocalDpi xmlns:a14="http://schemas.microsoft.com/office/drawing/2010/main" val="0"/>
+                        </a:ext>
+                      </a:extLst>
+                    </a:blip>
+                    <a:srcRect/>
+                    <a:stretch>
+                      <a:fillRect/>
+                    </a:stretch>
+                  </pic:blipFill>
+                  <pic:spPr bwMode="auto">
+                    <a:xfrm>
+                      <a:off x="0" y="0"/>
+                      <a:ext cx="1521460" cy="1705610"/>
+                    </a:xfrm>
+                    <a:prstGeom prst="rect">
+                      <a:avLst/>
+                    </a:prstGeom>
+                    <a:noFill/>
+                  </pic:spPr>
+                </pic:pic>
+              </a:graphicData>
+            </a:graphic>
+            <wp14:sizeRelH relativeFrom="margin">
+              <wp14:pctWidth>0</wp14:pctWidth>
+            </wp14:sizeRelH>
+            <wp14:sizeRelV relativeFrom="margin">
+              <wp14:pctHeight>0</wp14:pctHeight>
+            </wp14:sizeRelV>
+          </wp:anchor>
+        </w:drawing>
+      </w:r>
+    </w:p>
     <w:p/>
     <w:p/>
     <w:p>
@@ -4658,6 +5652,71 @@
           <w:tab w:val="left" w:pos="6405"/>
         </w:tabs>
       </w:pPr>
+      <w:r>
+        <w:drawing>
+          <wp:anchor distT="0" distB="0" distL="114300" distR="114300" simplePos="0" relativeHeight="251730944" behindDoc="0" locked="0" layoutInCell="1" allowOverlap="1" wp14:anchorId="36561A2C" wp14:editId="312EC43A">
+            <wp:simplePos x="0" y="0"/>
+            <wp:positionH relativeFrom="margin">
+              <wp:posOffset>3952875</wp:posOffset>
+            </wp:positionH>
+            <wp:positionV relativeFrom="paragraph">
+              <wp:posOffset>565150</wp:posOffset>
+            </wp:positionV>
+            <wp:extent cx="1214755" cy="1590675"/>
+            <wp:effectExtent l="0" t="0" r="4445" b="9525"/>
+            <wp:wrapThrough wrapText="bothSides">
+              <wp:wrapPolygon edited="0">
+                <wp:start x="0" y="0"/>
+                <wp:lineTo x="0" y="21471"/>
+                <wp:lineTo x="21340" y="21471"/>
+                <wp:lineTo x="21340" y="0"/>
+                <wp:lineTo x="0" y="0"/>
+              </wp:wrapPolygon>
+            </wp:wrapThrough>
+            <wp:docPr id="1853433770" name="Picture 1"/>
+            <wp:cNvGraphicFramePr>
+              <a:graphicFrameLocks xmlns:a="http://schemas.openxmlformats.org/drawingml/2006/main" noChangeAspect="1"/>
+            </wp:cNvGraphicFramePr>
+            <a:graphic xmlns:a="http://schemas.openxmlformats.org/drawingml/2006/main">
+              <a:graphicData uri="http://schemas.openxmlformats.org/drawingml/2006/picture">
+                <pic:pic xmlns:pic="http://schemas.openxmlformats.org/drawingml/2006/picture">
+                  <pic:nvPicPr>
+                    <pic:cNvPr id="1853433770" name=""/>
+                    <pic:cNvPicPr/>
+                  </pic:nvPicPr>
+                  <pic:blipFill>
+                    <a:blip r:embed="rId20" cstate="print">
+                      <a:extLst>
+                        <a:ext uri="{28A0092B-C50C-407E-A947-70E740481C1C}">
+                          <a14:useLocalDpi xmlns:a14="http://schemas.microsoft.com/office/drawing/2010/main" val="0"/>
+                        </a:ext>
+                      </a:extLst>
+                    </a:blip>
+                    <a:stretch>
+                      <a:fillRect/>
+                    </a:stretch>
+                  </pic:blipFill>
+                  <pic:spPr>
+                    <a:xfrm>
+                      <a:off x="0" y="0"/>
+                      <a:ext cx="1214755" cy="1590675"/>
+                    </a:xfrm>
+                    <a:prstGeom prst="rect">
+                      <a:avLst/>
+                    </a:prstGeom>
+                  </pic:spPr>
+                </pic:pic>
+              </a:graphicData>
+            </a:graphic>
+            <wp14:sizeRelH relativeFrom="margin">
+              <wp14:pctWidth>0</wp14:pctWidth>
+            </wp14:sizeRelH>
+            <wp14:sizeRelV relativeFrom="margin">
+              <wp14:pctHeight>0</wp14:pctHeight>
+            </wp14:sizeRelV>
+          </wp:anchor>
+        </w:drawing>
+      </w:r>
       <w:r>
         <w:tab/>
       </w:r>
@@ -4689,7 +5748,7 @@
     </w:p>
     <w:p>
       <w:pPr>
-        <w:pStyle w:val="Prrafodelista"/>
+        <w:pStyle w:val="ListParagraph"/>
         <w:numPr>
           <w:ilvl w:val="0"/>
           <w:numId w:val="1"/>
@@ -4739,6 +5798,18 @@
         </w:rPr>
         <w:t xml:space="preserve">respuesta. </w:t>
       </w:r>
+    </w:p>
+    <w:p>
+      <w:pPr>
+        <w:tabs>
+          <w:tab w:val="left" w:pos="7157"/>
+        </w:tabs>
+        <w:jc w:val="both"/>
+        <w:rPr>
+          <w:b/>
+          <w:bCs/>
+        </w:rPr>
+      </w:pPr>
     </w:p>
     <w:p>
       <w:pPr>
@@ -4749,7 +5820,7 @@
       </w:pPr>
     </w:p>
     <w:sectPr>
-      <w:headerReference w:type="default" r:id="rId7"/>
+      <w:headerReference w:type="default" r:id="rId21"/>
       <w:pgSz w:w="11906" w:h="16838"/>
       <w:pgMar w:top="1417" w:right="1701" w:bottom="1417" w:left="1701" w:header="708" w:footer="708" w:gutter="0"/>
       <w:cols w:space="708"/>
@@ -4761,7 +5832,7 @@
 </file>
 
 <file path=word/endnotes.xml><?xml version="1.0" encoding="utf-8"?>
-<w:endnotes xmlns:wpc="http://schemas.microsoft.com/office/word/2010/wordprocessingCanvas" xmlns:cx="http://schemas.microsoft.com/office/drawing/2014/chartex" xmlns:cx1="http://schemas.microsoft.com/office/drawing/2015/9/8/chartex" xmlns:cx2="http://schemas.microsoft.com/office/drawing/2015/10/21/chartex" xmlns:cx3="http://schemas.microsoft.com/office/drawing/2016/5/9/chartex" xmlns:cx4="http://schemas.microsoft.com/office/drawing/2016/5/10/chartex" xmlns:cx5="http://schemas.microsoft.com/office/drawing/2016/5/11/chartex" xmlns:cx6="http://schemas.microsoft.com/office/drawing/2016/5/12/chartex" xmlns:cx7="http://schemas.microsoft.com/office/drawing/2016/5/13/chartex" xmlns:cx8="http://schemas.microsoft.com/office/drawing/2016/5/14/chartex" xmlns:mc="http://schemas.openxmlformats.org/markup-compatibility/2006" xmlns:aink="http://schemas.microsoft.com/office/drawing/2016/ink" xmlns:am3d="http://schemas.microsoft.com/office/drawing/2017/model3d" xmlns:o="urn:schemas-microsoft-com:office:office" xmlns:r="http://schemas.openxmlformats.org/officeDocument/2006/relationships" xmlns:m="http://schemas.openxmlformats.org/officeDocument/2006/math" xmlns:v="urn:schemas-microsoft-com:vml" xmlns:wp14="http://schemas.microsoft.com/office/word/2010/wordprocessingDrawing" xmlns:wp="http://schemas.openxmlformats.org/drawingml/2006/wordprocessingDrawing" xmlns:w10="urn:schemas-microsoft-com:office:word" xmlns:w="http://schemas.openxmlformats.org/wordprocessingml/2006/main" xmlns:w14="http://schemas.microsoft.com/office/word/2010/wordml" xmlns:w15="http://schemas.microsoft.com/office/word/2012/wordml" xmlns:w16cex="http://schemas.microsoft.com/office/word/2018/wordml/cex" xmlns:w16cid="http://schemas.microsoft.com/office/word/2016/wordml/cid" xmlns:w16="http://schemas.microsoft.com/office/word/2018/wordml" xmlns:w16sdtdh="http://schemas.microsoft.com/office/word/2020/wordml/sdtdatahash" xmlns:w16se="http://schemas.microsoft.com/office/word/2015/wordml/symex" xmlns:wpg="http://schemas.microsoft.com/office/word/2010/wordprocessingGroup" xmlns:wpi="http://schemas.microsoft.com/office/word/2010/wordprocessingInk" xmlns:wne="http://schemas.microsoft.com/office/word/2006/wordml" xmlns:wps="http://schemas.microsoft.com/office/word/2010/wordprocessingShape" mc:Ignorable="w14 w15 w16se w16cid w16 w16cex w16sdtdh wp14">
+<w:endnotes xmlns:wpc="http://schemas.microsoft.com/office/word/2010/wordprocessingCanvas" xmlns:cx="http://schemas.microsoft.com/office/drawing/2014/chartex" xmlns:cx1="http://schemas.microsoft.com/office/drawing/2015/9/8/chartex" xmlns:cx2="http://schemas.microsoft.com/office/drawing/2015/10/21/chartex" xmlns:cx3="http://schemas.microsoft.com/office/drawing/2016/5/9/chartex" xmlns:cx4="http://schemas.microsoft.com/office/drawing/2016/5/10/chartex" xmlns:cx5="http://schemas.microsoft.com/office/drawing/2016/5/11/chartex" xmlns:cx6="http://schemas.microsoft.com/office/drawing/2016/5/12/chartex" xmlns:cx7="http://schemas.microsoft.com/office/drawing/2016/5/13/chartex" xmlns:cx8="http://schemas.microsoft.com/office/drawing/2016/5/14/chartex" xmlns:mc="http://schemas.openxmlformats.org/markup-compatibility/2006" xmlns:aink="http://schemas.microsoft.com/office/drawing/2016/ink" xmlns:am3d="http://schemas.microsoft.com/office/drawing/2017/model3d" xmlns:o="urn:schemas-microsoft-com:office:office" xmlns:oel="http://schemas.microsoft.com/office/2019/extlst" xmlns:r="http://schemas.openxmlformats.org/officeDocument/2006/relationships" xmlns:m="http://schemas.openxmlformats.org/officeDocument/2006/math" xmlns:v="urn:schemas-microsoft-com:vml" xmlns:wp14="http://schemas.microsoft.com/office/word/2010/wordprocessingDrawing" xmlns:wp="http://schemas.openxmlformats.org/drawingml/2006/wordprocessingDrawing" xmlns:w10="urn:schemas-microsoft-com:office:word" xmlns:w="http://schemas.openxmlformats.org/wordprocessingml/2006/main" xmlns:w14="http://schemas.microsoft.com/office/word/2010/wordml" xmlns:w15="http://schemas.microsoft.com/office/word/2012/wordml" xmlns:w16cex="http://schemas.microsoft.com/office/word/2018/wordml/cex" xmlns:w16cid="http://schemas.microsoft.com/office/word/2016/wordml/cid" xmlns:w16="http://schemas.microsoft.com/office/word/2018/wordml" xmlns:w16du="http://schemas.microsoft.com/office/word/2023/wordml/word16du" xmlns:w16sdtdh="http://schemas.microsoft.com/office/word/2020/wordml/sdtdatahash" xmlns:w16sdtfl="http://schemas.microsoft.com/office/word/2024/wordml/sdtformatlock" xmlns:w16se="http://schemas.microsoft.com/office/word/2015/wordml/symex" xmlns:wpg="http://schemas.microsoft.com/office/word/2010/wordprocessingGroup" xmlns:wpi="http://schemas.microsoft.com/office/word/2010/wordprocessingInk" xmlns:wne="http://schemas.microsoft.com/office/word/2006/wordml" xmlns:wps="http://schemas.microsoft.com/office/word/2010/wordprocessingShape" mc:Ignorable="w14 w15 w16se w16cid w16 w16cex w16sdtdh w16sdtfl w16du wp14">
   <w:endnote w:type="separator" w:id="-1">
     <w:p>
       <w:pPr>
@@ -4786,7 +5857,7 @@
 </file>
 
 <file path=word/footnotes.xml><?xml version="1.0" encoding="utf-8"?>
-<w:footnotes xmlns:wpc="http://schemas.microsoft.com/office/word/2010/wordprocessingCanvas" xmlns:cx="http://schemas.microsoft.com/office/drawing/2014/chartex" xmlns:cx1="http://schemas.microsoft.com/office/drawing/2015/9/8/chartex" xmlns:cx2="http://schemas.microsoft.com/office/drawing/2015/10/21/chartex" xmlns:cx3="http://schemas.microsoft.com/office/drawing/2016/5/9/chartex" xmlns:cx4="http://schemas.microsoft.com/office/drawing/2016/5/10/chartex" xmlns:cx5="http://schemas.microsoft.com/office/drawing/2016/5/11/chartex" xmlns:cx6="http://schemas.microsoft.com/office/drawing/2016/5/12/chartex" xmlns:cx7="http://schemas.microsoft.com/office/drawing/2016/5/13/chartex" xmlns:cx8="http://schemas.microsoft.com/office/drawing/2016/5/14/chartex" xmlns:mc="http://schemas.openxmlformats.org/markup-compatibility/2006" xmlns:aink="http://schemas.microsoft.com/office/drawing/2016/ink" xmlns:am3d="http://schemas.microsoft.com/office/drawing/2017/model3d" xmlns:o="urn:schemas-microsoft-com:office:office" xmlns:r="http://schemas.openxmlformats.org/officeDocument/2006/relationships" xmlns:m="http://schemas.openxmlformats.org/officeDocument/2006/math" xmlns:v="urn:schemas-microsoft-com:vml" xmlns:wp14="http://schemas.microsoft.com/office/word/2010/wordprocessingDrawing" xmlns:wp="http://schemas.openxmlformats.org/drawingml/2006/wordprocessingDrawing" xmlns:w10="urn:schemas-microsoft-com:office:word" xmlns:w="http://schemas.openxmlformats.org/wordprocessingml/2006/main" xmlns:w14="http://schemas.microsoft.com/office/word/2010/wordml" xmlns:w15="http://schemas.microsoft.com/office/word/2012/wordml" xmlns:w16cex="http://schemas.microsoft.com/office/word/2018/wordml/cex" xmlns:w16cid="http://schemas.microsoft.com/office/word/2016/wordml/cid" xmlns:w16="http://schemas.microsoft.com/office/word/2018/wordml" xmlns:w16sdtdh="http://schemas.microsoft.com/office/word/2020/wordml/sdtdatahash" xmlns:w16se="http://schemas.microsoft.com/office/word/2015/wordml/symex" xmlns:wpg="http://schemas.microsoft.com/office/word/2010/wordprocessingGroup" xmlns:wpi="http://schemas.microsoft.com/office/word/2010/wordprocessingInk" xmlns:wne="http://schemas.microsoft.com/office/word/2006/wordml" xmlns:wps="http://schemas.microsoft.com/office/word/2010/wordprocessingShape" mc:Ignorable="w14 w15 w16se w16cid w16 w16cex w16sdtdh wp14">
+<w:footnotes xmlns:wpc="http://schemas.microsoft.com/office/word/2010/wordprocessingCanvas" xmlns:cx="http://schemas.microsoft.com/office/drawing/2014/chartex" xmlns:cx1="http://schemas.microsoft.com/office/drawing/2015/9/8/chartex" xmlns:cx2="http://schemas.microsoft.com/office/drawing/2015/10/21/chartex" xmlns:cx3="http://schemas.microsoft.com/office/drawing/2016/5/9/chartex" xmlns:cx4="http://schemas.microsoft.com/office/drawing/2016/5/10/chartex" xmlns:cx5="http://schemas.microsoft.com/office/drawing/2016/5/11/chartex" xmlns:cx6="http://schemas.microsoft.com/office/drawing/2016/5/12/chartex" xmlns:cx7="http://schemas.microsoft.com/office/drawing/2016/5/13/chartex" xmlns:cx8="http://schemas.microsoft.com/office/drawing/2016/5/14/chartex" xmlns:mc="http://schemas.openxmlformats.org/markup-compatibility/2006" xmlns:aink="http://schemas.microsoft.com/office/drawing/2016/ink" xmlns:am3d="http://schemas.microsoft.com/office/drawing/2017/model3d" xmlns:o="urn:schemas-microsoft-com:office:office" xmlns:oel="http://schemas.microsoft.com/office/2019/extlst" xmlns:r="http://schemas.openxmlformats.org/officeDocument/2006/relationships" xmlns:m="http://schemas.openxmlformats.org/officeDocument/2006/math" xmlns:v="urn:schemas-microsoft-com:vml" xmlns:wp14="http://schemas.microsoft.com/office/word/2010/wordprocessingDrawing" xmlns:wp="http://schemas.openxmlformats.org/drawingml/2006/wordprocessingDrawing" xmlns:w10="urn:schemas-microsoft-com:office:word" xmlns:w="http://schemas.openxmlformats.org/wordprocessingml/2006/main" xmlns:w14="http://schemas.microsoft.com/office/word/2010/wordml" xmlns:w15="http://schemas.microsoft.com/office/word/2012/wordml" xmlns:w16cex="http://schemas.microsoft.com/office/word/2018/wordml/cex" xmlns:w16cid="http://schemas.microsoft.com/office/word/2016/wordml/cid" xmlns:w16="http://schemas.microsoft.com/office/word/2018/wordml" xmlns:w16du="http://schemas.microsoft.com/office/word/2023/wordml/word16du" xmlns:w16sdtdh="http://schemas.microsoft.com/office/word/2020/wordml/sdtdatahash" xmlns:w16sdtfl="http://schemas.microsoft.com/office/word/2024/wordml/sdtformatlock" xmlns:w16se="http://schemas.microsoft.com/office/word/2015/wordml/symex" xmlns:wpg="http://schemas.microsoft.com/office/word/2010/wordprocessingGroup" xmlns:wpi="http://schemas.microsoft.com/office/word/2010/wordprocessingInk" xmlns:wne="http://schemas.microsoft.com/office/word/2006/wordml" xmlns:wps="http://schemas.microsoft.com/office/word/2010/wordprocessingShape" mc:Ignorable="w14 w15 w16se w16cid w16 w16cex w16sdtdh w16sdtfl w16du wp14">
   <w:footnote w:type="separator" w:id="-1">
     <w:p>
       <w:pPr>
@@ -4811,10 +5882,10 @@
 </file>
 
 <file path=word/header1.xml><?xml version="1.0" encoding="utf-8"?>
-<w:hdr xmlns:wpc="http://schemas.microsoft.com/office/word/2010/wordprocessingCanvas" xmlns:cx="http://schemas.microsoft.com/office/drawing/2014/chartex" xmlns:cx1="http://schemas.microsoft.com/office/drawing/2015/9/8/chartex" xmlns:cx2="http://schemas.microsoft.com/office/drawing/2015/10/21/chartex" xmlns:cx3="http://schemas.microsoft.com/office/drawing/2016/5/9/chartex" xmlns:cx4="http://schemas.microsoft.com/office/drawing/2016/5/10/chartex" xmlns:cx5="http://schemas.microsoft.com/office/drawing/2016/5/11/chartex" xmlns:cx6="http://schemas.microsoft.com/office/drawing/2016/5/12/chartex" xmlns:cx7="http://schemas.microsoft.com/office/drawing/2016/5/13/chartex" xmlns:cx8="http://schemas.microsoft.com/office/drawing/2016/5/14/chartex" xmlns:mc="http://schemas.openxmlformats.org/markup-compatibility/2006" xmlns:aink="http://schemas.microsoft.com/office/drawing/2016/ink" xmlns:am3d="http://schemas.microsoft.com/office/drawing/2017/model3d" xmlns:o="urn:schemas-microsoft-com:office:office" xmlns:r="http://schemas.openxmlformats.org/officeDocument/2006/relationships" xmlns:m="http://schemas.openxmlformats.org/officeDocument/2006/math" xmlns:v="urn:schemas-microsoft-com:vml" xmlns:wp14="http://schemas.microsoft.com/office/word/2010/wordprocessingDrawing" xmlns:wp="http://schemas.openxmlformats.org/drawingml/2006/wordprocessingDrawing" xmlns:w10="urn:schemas-microsoft-com:office:word" xmlns:w="http://schemas.openxmlformats.org/wordprocessingml/2006/main" xmlns:w14="http://schemas.microsoft.com/office/word/2010/wordml" xmlns:w15="http://schemas.microsoft.com/office/word/2012/wordml" xmlns:w16cex="http://schemas.microsoft.com/office/word/2018/wordml/cex" xmlns:w16cid="http://schemas.microsoft.com/office/word/2016/wordml/cid" xmlns:w16="http://schemas.microsoft.com/office/word/2018/wordml" xmlns:w16sdtdh="http://schemas.microsoft.com/office/word/2020/wordml/sdtdatahash" xmlns:w16se="http://schemas.microsoft.com/office/word/2015/wordml/symex" xmlns:wpg="http://schemas.microsoft.com/office/word/2010/wordprocessingGroup" xmlns:wpi="http://schemas.microsoft.com/office/word/2010/wordprocessingInk" xmlns:wne="http://schemas.microsoft.com/office/word/2006/wordml" xmlns:wps="http://schemas.microsoft.com/office/word/2010/wordprocessingShape" mc:Ignorable="w14 w15 w16se w16cid w16 w16cex w16sdtdh wp14">
+<w:hdr xmlns:wpc="http://schemas.microsoft.com/office/word/2010/wordprocessingCanvas" xmlns:cx="http://schemas.microsoft.com/office/drawing/2014/chartex" xmlns:cx1="http://schemas.microsoft.com/office/drawing/2015/9/8/chartex" xmlns:cx2="http://schemas.microsoft.com/office/drawing/2015/10/21/chartex" xmlns:cx3="http://schemas.microsoft.com/office/drawing/2016/5/9/chartex" xmlns:cx4="http://schemas.microsoft.com/office/drawing/2016/5/10/chartex" xmlns:cx5="http://schemas.microsoft.com/office/drawing/2016/5/11/chartex" xmlns:cx6="http://schemas.microsoft.com/office/drawing/2016/5/12/chartex" xmlns:cx7="http://schemas.microsoft.com/office/drawing/2016/5/13/chartex" xmlns:cx8="http://schemas.microsoft.com/office/drawing/2016/5/14/chartex" xmlns:mc="http://schemas.openxmlformats.org/markup-compatibility/2006" xmlns:aink="http://schemas.microsoft.com/office/drawing/2016/ink" xmlns:am3d="http://schemas.microsoft.com/office/drawing/2017/model3d" xmlns:o="urn:schemas-microsoft-com:office:office" xmlns:oel="http://schemas.microsoft.com/office/2019/extlst" xmlns:r="http://schemas.openxmlformats.org/officeDocument/2006/relationships" xmlns:m="http://schemas.openxmlformats.org/officeDocument/2006/math" xmlns:v="urn:schemas-microsoft-com:vml" xmlns:wp14="http://schemas.microsoft.com/office/word/2010/wordprocessingDrawing" xmlns:wp="http://schemas.openxmlformats.org/drawingml/2006/wordprocessingDrawing" xmlns:w10="urn:schemas-microsoft-com:office:word" xmlns:w="http://schemas.openxmlformats.org/wordprocessingml/2006/main" xmlns:w14="http://schemas.microsoft.com/office/word/2010/wordml" xmlns:w15="http://schemas.microsoft.com/office/word/2012/wordml" xmlns:w16cex="http://schemas.microsoft.com/office/word/2018/wordml/cex" xmlns:w16cid="http://schemas.microsoft.com/office/word/2016/wordml/cid" xmlns:w16="http://schemas.microsoft.com/office/word/2018/wordml" xmlns:w16du="http://schemas.microsoft.com/office/word/2023/wordml/word16du" xmlns:w16sdtdh="http://schemas.microsoft.com/office/word/2020/wordml/sdtdatahash" xmlns:w16sdtfl="http://schemas.microsoft.com/office/word/2024/wordml/sdtformatlock" xmlns:w16se="http://schemas.microsoft.com/office/word/2015/wordml/symex" xmlns:wpg="http://schemas.microsoft.com/office/word/2010/wordprocessingGroup" xmlns:wpi="http://schemas.microsoft.com/office/word/2010/wordprocessingInk" xmlns:wne="http://schemas.microsoft.com/office/word/2006/wordml" xmlns:wps="http://schemas.microsoft.com/office/word/2010/wordprocessingShape" mc:Ignorable="w14 w15 w16se w16cid w16 w16cex w16sdtdh w16sdtfl w16du wp14">
   <w:p>
     <w:pPr>
-      <w:pStyle w:val="Encabezado"/>
+      <w:pStyle w:val="Header"/>
       <w:rPr>
         <w:i/>
         <w:iCs/>
@@ -4888,7 +5959,7 @@
   </w:p>
   <w:p>
     <w:pPr>
-      <w:pStyle w:val="Encabezado"/>
+      <w:pStyle w:val="Header"/>
       <w:rPr>
         <w:i/>
         <w:iCs/>
@@ -4918,14 +5989,14 @@
   </w:p>
   <w:p>
     <w:pPr>
-      <w:pStyle w:val="Encabezado"/>
+      <w:pStyle w:val="Header"/>
     </w:pPr>
   </w:p>
 </w:hdr>
 </file>
 
 <file path=word/numbering.xml><?xml version="1.0" encoding="utf-8"?>
-<w:numbering xmlns:wpc="http://schemas.microsoft.com/office/word/2010/wordprocessingCanvas" xmlns:cx="http://schemas.microsoft.com/office/drawing/2014/chartex" xmlns:cx1="http://schemas.microsoft.com/office/drawing/2015/9/8/chartex" xmlns:cx2="http://schemas.microsoft.com/office/drawing/2015/10/21/chartex" xmlns:cx3="http://schemas.microsoft.com/office/drawing/2016/5/9/chartex" xmlns:cx4="http://schemas.microsoft.com/office/drawing/2016/5/10/chartex" xmlns:cx5="http://schemas.microsoft.com/office/drawing/2016/5/11/chartex" xmlns:cx6="http://schemas.microsoft.com/office/drawing/2016/5/12/chartex" xmlns:cx7="http://schemas.microsoft.com/office/drawing/2016/5/13/chartex" xmlns:cx8="http://schemas.microsoft.com/office/drawing/2016/5/14/chartex" xmlns:mc="http://schemas.openxmlformats.org/markup-compatibility/2006" xmlns:aink="http://schemas.microsoft.com/office/drawing/2016/ink" xmlns:am3d="http://schemas.microsoft.com/office/drawing/2017/model3d" xmlns:o="urn:schemas-microsoft-com:office:office" xmlns:r="http://schemas.openxmlformats.org/officeDocument/2006/relationships" xmlns:m="http://schemas.openxmlformats.org/officeDocument/2006/math" xmlns:v="urn:schemas-microsoft-com:vml" xmlns:wp14="http://schemas.microsoft.com/office/word/2010/wordprocessingDrawing" xmlns:wp="http://schemas.openxmlformats.org/drawingml/2006/wordprocessingDrawing" xmlns:w10="urn:schemas-microsoft-com:office:word" xmlns:w="http://schemas.openxmlformats.org/wordprocessingml/2006/main" xmlns:w14="http://schemas.microsoft.com/office/word/2010/wordml" xmlns:w15="http://schemas.microsoft.com/office/word/2012/wordml" xmlns:w16cex="http://schemas.microsoft.com/office/word/2018/wordml/cex" xmlns:w16cid="http://schemas.microsoft.com/office/word/2016/wordml/cid" xmlns:w16="http://schemas.microsoft.com/office/word/2018/wordml" xmlns:w16sdtdh="http://schemas.microsoft.com/office/word/2020/wordml/sdtdatahash" xmlns:w16se="http://schemas.microsoft.com/office/word/2015/wordml/symex" xmlns:wpg="http://schemas.microsoft.com/office/word/2010/wordprocessingGroup" xmlns:wpi="http://schemas.microsoft.com/office/word/2010/wordprocessingInk" xmlns:wne="http://schemas.microsoft.com/office/word/2006/wordml" xmlns:wps="http://schemas.microsoft.com/office/word/2010/wordprocessingShape" mc:Ignorable="w14 w15 w16se w16cid w16 w16cex w16sdtdh wp14">
+<w:numbering xmlns:wpc="http://schemas.microsoft.com/office/word/2010/wordprocessingCanvas" xmlns:cx="http://schemas.microsoft.com/office/drawing/2014/chartex" xmlns:cx1="http://schemas.microsoft.com/office/drawing/2015/9/8/chartex" xmlns:cx2="http://schemas.microsoft.com/office/drawing/2015/10/21/chartex" xmlns:cx3="http://schemas.microsoft.com/office/drawing/2016/5/9/chartex" xmlns:cx4="http://schemas.microsoft.com/office/drawing/2016/5/10/chartex" xmlns:cx5="http://schemas.microsoft.com/office/drawing/2016/5/11/chartex" xmlns:cx6="http://schemas.microsoft.com/office/drawing/2016/5/12/chartex" xmlns:cx7="http://schemas.microsoft.com/office/drawing/2016/5/13/chartex" xmlns:cx8="http://schemas.microsoft.com/office/drawing/2016/5/14/chartex" xmlns:mc="http://schemas.openxmlformats.org/markup-compatibility/2006" xmlns:aink="http://schemas.microsoft.com/office/drawing/2016/ink" xmlns:am3d="http://schemas.microsoft.com/office/drawing/2017/model3d" xmlns:o="urn:schemas-microsoft-com:office:office" xmlns:oel="http://schemas.microsoft.com/office/2019/extlst" xmlns:r="http://schemas.openxmlformats.org/officeDocument/2006/relationships" xmlns:m="http://schemas.openxmlformats.org/officeDocument/2006/math" xmlns:v="urn:schemas-microsoft-com:vml" xmlns:wp14="http://schemas.microsoft.com/office/word/2010/wordprocessingDrawing" xmlns:wp="http://schemas.openxmlformats.org/drawingml/2006/wordprocessingDrawing" xmlns:w10="urn:schemas-microsoft-com:office:word" xmlns:w="http://schemas.openxmlformats.org/wordprocessingml/2006/main" xmlns:w14="http://schemas.microsoft.com/office/word/2010/wordml" xmlns:w15="http://schemas.microsoft.com/office/word/2012/wordml" xmlns:w16cex="http://schemas.microsoft.com/office/word/2018/wordml/cex" xmlns:w16cid="http://schemas.microsoft.com/office/word/2016/wordml/cid" xmlns:w16="http://schemas.microsoft.com/office/word/2018/wordml" xmlns:w16du="http://schemas.microsoft.com/office/word/2023/wordml/word16du" xmlns:w16sdtdh="http://schemas.microsoft.com/office/word/2020/wordml/sdtdatahash" xmlns:w16sdtfl="http://schemas.microsoft.com/office/word/2024/wordml/sdtformatlock" xmlns:w16se="http://schemas.microsoft.com/office/word/2015/wordml/symex" xmlns:wpg="http://schemas.microsoft.com/office/word/2010/wordprocessingGroup" xmlns:wpi="http://schemas.microsoft.com/office/word/2010/wordprocessingInk" xmlns:wne="http://schemas.microsoft.com/office/word/2006/wordml" xmlns:wps="http://schemas.microsoft.com/office/word/2010/wordprocessingShape" mc:Ignorable="w14 w15 w16se w16cid w16 w16cex w16sdtdh w16sdtfl w16du wp14">
   <w:abstractNum w:abstractNumId="0" w15:restartNumberingAfterBreak="0">
     <w:nsid w:val="427367CE"/>
     <w:multiLevelType w:val="hybridMultilevel"/>
@@ -5106,17 +6177,17 @@
       </w:pPr>
     </w:lvl>
   </w:abstractNum>
-  <w:num w:numId="1">
+  <w:num w:numId="1" w16cid:durableId="236018572">
     <w:abstractNumId w:val="0"/>
   </w:num>
-  <w:num w:numId="2">
+  <w:num w:numId="2" w16cid:durableId="1937249156">
     <w:abstractNumId w:val="1"/>
   </w:num>
 </w:numbering>
 </file>
 
 <file path=word/styles.xml><?xml version="1.0" encoding="utf-8"?>
-<w:styles xmlns:mc="http://schemas.openxmlformats.org/markup-compatibility/2006" xmlns:r="http://schemas.openxmlformats.org/officeDocument/2006/relationships" xmlns:w="http://schemas.openxmlformats.org/wordprocessingml/2006/main" xmlns:w14="http://schemas.microsoft.com/office/word/2010/wordml" xmlns:w15="http://schemas.microsoft.com/office/word/2012/wordml" xmlns:w16cex="http://schemas.microsoft.com/office/word/2018/wordml/cex" xmlns:w16cid="http://schemas.microsoft.com/office/word/2016/wordml/cid" xmlns:w16="http://schemas.microsoft.com/office/word/2018/wordml" xmlns:w16sdtdh="http://schemas.microsoft.com/office/word/2020/wordml/sdtdatahash" xmlns:w16se="http://schemas.microsoft.com/office/word/2015/wordml/symex" mc:Ignorable="w14 w15 w16se w16cid w16 w16cex w16sdtdh">
+<w:styles xmlns:mc="http://schemas.openxmlformats.org/markup-compatibility/2006" xmlns:r="http://schemas.openxmlformats.org/officeDocument/2006/relationships" xmlns:w="http://schemas.openxmlformats.org/wordprocessingml/2006/main" xmlns:w14="http://schemas.microsoft.com/office/word/2010/wordml" xmlns:w15="http://schemas.microsoft.com/office/word/2012/wordml" xmlns:w16cex="http://schemas.microsoft.com/office/word/2018/wordml/cex" xmlns:w16cid="http://schemas.microsoft.com/office/word/2016/wordml/cid" xmlns:w16="http://schemas.microsoft.com/office/word/2018/wordml" xmlns:w16du="http://schemas.microsoft.com/office/word/2023/wordml/word16du" xmlns:w16sdtdh="http://schemas.microsoft.com/office/word/2020/wordml/sdtdatahash" xmlns:w16sdtfl="http://schemas.microsoft.com/office/word/2024/wordml/sdtformatlock" xmlns:w16se="http://schemas.microsoft.com/office/word/2015/wordml/symex" mc:Ignorable="w14 w15 w16se w16cid w16 w16cex w16sdtdh w16sdtfl w16du">
   <w:docDefaults>
     <w:rPrDefault>
       <w:rPr>
@@ -5514,13 +6585,12 @@
     <w:name w:val="Normal"/>
     <w:qFormat/>
   </w:style>
-  <w:style w:type="character" w:default="1" w:styleId="Fuentedeprrafopredeter">
+  <w:style w:type="character" w:default="1" w:styleId="DefaultParagraphFont">
     <w:name w:val="Default Paragraph Font"/>
     <w:uiPriority w:val="1"/>
-    <w:semiHidden/>
     <w:unhideWhenUsed/>
   </w:style>
-  <w:style w:type="table" w:default="1" w:styleId="Tablanormal">
+  <w:style w:type="table" w:default="1" w:styleId="TableNormal">
     <w:name w:val="Normal Table"/>
     <w:uiPriority w:val="99"/>
     <w:semiHidden/>
@@ -5535,13 +6605,13 @@
       </w:tblCellMar>
     </w:tblPr>
   </w:style>
-  <w:style w:type="numbering" w:default="1" w:styleId="Sinlista">
+  <w:style w:type="numbering" w:default="1" w:styleId="NoList">
     <w:name w:val="No List"/>
     <w:uiPriority w:val="99"/>
     <w:semiHidden/>
     <w:unhideWhenUsed/>
   </w:style>
-  <w:style w:type="paragraph" w:styleId="Prrafodelista">
+  <w:style w:type="paragraph" w:styleId="ListParagraph">
     <w:name w:val="List Paragraph"/>
     <w:basedOn w:val="Normal"/>
     <w:uiPriority w:val="34"/>
@@ -5552,9 +6622,9 @@
       <w:contextualSpacing/>
     </w:pPr>
   </w:style>
-  <w:style w:type="table" w:styleId="Tablaconcuadrcula">
+  <w:style w:type="table" w:styleId="TableGrid">
     <w:name w:val="Table Grid"/>
-    <w:basedOn w:val="Tablanormal"/>
+    <w:basedOn w:val="TableNormal"/>
     <w:uiPriority w:val="39"/>
     <w:rsid w:val="008D54DF"/>
     <w:pPr>
@@ -5571,10 +6641,10 @@
       </w:tblBorders>
     </w:tblPr>
   </w:style>
-  <w:style w:type="paragraph" w:styleId="Encabezado">
+  <w:style w:type="paragraph" w:styleId="Header">
     <w:name w:val="header"/>
     <w:basedOn w:val="Normal"/>
-    <w:link w:val="EncabezadoCar"/>
+    <w:link w:val="HeaderChar"/>
     <w:uiPriority w:val="99"/>
     <w:unhideWhenUsed/>
     <w:rsid w:val="005A6591"/>
@@ -5586,17 +6656,17 @@
       <w:spacing w:after="0" w:line="240" w:lineRule="auto"/>
     </w:pPr>
   </w:style>
-  <w:style w:type="character" w:customStyle="1" w:styleId="EncabezadoCar">
-    <w:name w:val="Encabezado Car"/>
-    <w:basedOn w:val="Fuentedeprrafopredeter"/>
-    <w:link w:val="Encabezado"/>
+  <w:style w:type="character" w:customStyle="1" w:styleId="HeaderChar">
+    <w:name w:val="Header Char"/>
+    <w:basedOn w:val="DefaultParagraphFont"/>
+    <w:link w:val="Header"/>
     <w:uiPriority w:val="99"/>
     <w:rsid w:val="005A6591"/>
   </w:style>
-  <w:style w:type="paragraph" w:styleId="Piedepgina">
+  <w:style w:type="paragraph" w:styleId="Footer">
     <w:name w:val="footer"/>
     <w:basedOn w:val="Normal"/>
-    <w:link w:val="PiedepginaCar"/>
+    <w:link w:val="FooterChar"/>
     <w:uiPriority w:val="99"/>
     <w:unhideWhenUsed/>
     <w:rsid w:val="005A6591"/>
@@ -5608,17 +6678,17 @@
       <w:spacing w:after="0" w:line="240" w:lineRule="auto"/>
     </w:pPr>
   </w:style>
-  <w:style w:type="character" w:customStyle="1" w:styleId="PiedepginaCar">
-    <w:name w:val="Pie de página Car"/>
-    <w:basedOn w:val="Fuentedeprrafopredeter"/>
-    <w:link w:val="Piedepgina"/>
+  <w:style w:type="character" w:customStyle="1" w:styleId="FooterChar">
+    <w:name w:val="Footer Char"/>
+    <w:basedOn w:val="DefaultParagraphFont"/>
+    <w:link w:val="Footer"/>
     <w:uiPriority w:val="99"/>
     <w:rsid w:val="005A6591"/>
   </w:style>
-  <w:style w:type="paragraph" w:styleId="HTMLconformatoprevio">
+  <w:style w:type="paragraph" w:styleId="HTMLPreformatted">
     <w:name w:val="HTML Preformatted"/>
     <w:basedOn w:val="Normal"/>
-    <w:link w:val="HTMLconformatoprevioCar"/>
+    <w:link w:val="HTMLPreformattedChar"/>
     <w:uiPriority w:val="99"/>
     <w:unhideWhenUsed/>
     <w:rsid w:val="005A6591"/>
@@ -5650,10 +6720,10 @@
       <w:lang w:eastAsia="es-ES"/>
     </w:rPr>
   </w:style>
-  <w:style w:type="character" w:customStyle="1" w:styleId="HTMLconformatoprevioCar">
-    <w:name w:val="HTML con formato previo Car"/>
-    <w:basedOn w:val="Fuentedeprrafopredeter"/>
-    <w:link w:val="HTMLconformatoprevio"/>
+  <w:style w:type="character" w:customStyle="1" w:styleId="HTMLPreformattedChar">
+    <w:name w:val="HTML Preformatted Char"/>
+    <w:basedOn w:val="DefaultParagraphFont"/>
+    <w:link w:val="HTMLPreformatted"/>
     <w:uiPriority w:val="99"/>
     <w:rsid w:val="005A6591"/>
     <w:rPr>

</xml_diff>